<commit_message>
✅ Range Violation Rule
</commit_message>
<xml_diff>
--- a/notes.docx
+++ b/notes.docx
@@ -182,10 +182,1285 @@
         <w:t>0050 hex = 80 decimal</w:t>
       </w:r>
     </w:p>
-    <w:p/>
-    <w:p>
+    <w:p>
+      <w:pPr>
+        <w:pBdr>
+          <w:bottom w:val="single" w:sz="6" w:space="1" w:color="auto"/>
+        </w:pBdr>
+      </w:pPr>
+    </w:p>
+    <w:p>
+      <w:pPr>
+        <w:rPr>
+          <w:lang w:bidi="fa-IR"/>
+        </w:rPr>
+      </w:pPr>
+    </w:p>
+    <w:p>
+      <w:pPr>
+        <w:rPr>
+          <w:lang w:bidi="fa-IR"/>
+        </w:rPr>
+      </w:pPr>
+      <w:r>
+        <w:rPr>
+          <w:rFonts w:ascii="Segoe UI Symbol" w:hAnsi="Segoe UI Symbol" w:cs="Segoe UI Symbol"/>
+          <w:lang w:bidi="fa-IR"/>
+        </w:rPr>
+        <w:lastRenderedPageBreak/>
+        <w:t>✅</w:t>
+      </w:r>
+      <w:r>
+        <w:rPr>
+          <w:lang w:bidi="fa-IR"/>
+        </w:rPr>
+        <w:t xml:space="preserve"> </w:t>
+      </w:r>
+      <w:proofErr w:type="spellStart"/>
+      <w:r>
+        <w:rPr>
+          <w:lang w:bidi="fa-IR"/>
+        </w:rPr>
+        <w:t>Qt</w:t>
+      </w:r>
+      <w:proofErr w:type="spellEnd"/>
+      <w:r>
+        <w:rPr>
+          <w:lang w:bidi="fa-IR"/>
+        </w:rPr>
+        <w:t xml:space="preserve"> 5.14.2 / </w:t>
+      </w:r>
+      <w:proofErr w:type="spellStart"/>
+      <w:r>
+        <w:rPr>
+          <w:lang w:bidi="fa-IR"/>
+        </w:rPr>
+        <w:t>MinGW</w:t>
+      </w:r>
+      <w:proofErr w:type="spellEnd"/>
+      <w:r>
+        <w:rPr>
+          <w:lang w:bidi="fa-IR"/>
+        </w:rPr>
+        <w:t xml:space="preserve"> / Windows</w:t>
+      </w:r>
+    </w:p>
+    <w:p>
+      <w:pPr>
+        <w:rPr>
+          <w:lang w:bidi="fa-IR"/>
+        </w:rPr>
+      </w:pPr>
+      <w:r>
+        <w:rPr>
+          <w:rFonts w:ascii="Segoe UI Symbol" w:hAnsi="Segoe UI Symbol" w:cs="Segoe UI Symbol"/>
+          <w:lang w:bidi="fa-IR"/>
+        </w:rPr>
+        <w:t>✅</w:t>
+      </w:r>
+      <w:r>
+        <w:rPr>
+          <w:lang w:bidi="fa-IR"/>
+        </w:rPr>
+        <w:t xml:space="preserve"> PostgreSQL + </w:t>
+      </w:r>
+      <w:proofErr w:type="spellStart"/>
+      <w:r>
+        <w:rPr>
+          <w:lang w:bidi="fa-IR"/>
+        </w:rPr>
+        <w:t>TimescaleDB</w:t>
+      </w:r>
+      <w:proofErr w:type="spellEnd"/>
+    </w:p>
+    <w:p>
+      <w:pPr>
+        <w:rPr>
+          <w:lang w:bidi="fa-IR"/>
+        </w:rPr>
+      </w:pPr>
+      <w:r>
+        <w:rPr>
+          <w:rFonts w:ascii="Segoe UI Symbol" w:hAnsi="Segoe UI Symbol" w:cs="Segoe UI Symbol"/>
+          <w:lang w:bidi="fa-IR"/>
+        </w:rPr>
+        <w:t>✅</w:t>
+      </w:r>
+      <w:r>
+        <w:rPr>
+          <w:lang w:bidi="fa-IR"/>
+        </w:rPr>
+        <w:t xml:space="preserve"> </w:t>
+      </w:r>
+      <w:proofErr w:type="spellStart"/>
+      <w:r>
+        <w:rPr>
+          <w:lang w:bidi="fa-IR"/>
+        </w:rPr>
+        <w:t>Config</w:t>
+      </w:r>
+      <w:proofErr w:type="spellEnd"/>
+      <w:r>
+        <w:rPr>
+          <w:lang w:bidi="fa-IR"/>
+        </w:rPr>
+        <w:t xml:space="preserve"> from Database (</w:t>
+      </w:r>
+      <w:proofErr w:type="spellStart"/>
+      <w:r>
+        <w:rPr>
+          <w:lang w:bidi="fa-IR"/>
+        </w:rPr>
+        <w:t>system_settings</w:t>
+      </w:r>
+      <w:proofErr w:type="spellEnd"/>
+      <w:r>
+        <w:rPr>
+          <w:lang w:bidi="fa-IR"/>
+        </w:rPr>
+        <w:t xml:space="preserve">, tags, </w:t>
+      </w:r>
+      <w:proofErr w:type="spellStart"/>
+      <w:r>
+        <w:rPr>
+          <w:lang w:bidi="fa-IR"/>
+        </w:rPr>
+        <w:t>threshold_rules</w:t>
+      </w:r>
+      <w:proofErr w:type="spellEnd"/>
+      <w:r>
+        <w:rPr>
+          <w:lang w:bidi="fa-IR"/>
+        </w:rPr>
+        <w:t>, drivers)</w:t>
+      </w:r>
+    </w:p>
+    <w:p>
+      <w:pPr>
+        <w:rPr>
+          <w:lang w:bidi="fa-IR"/>
+        </w:rPr>
+      </w:pPr>
+      <w:r>
+        <w:rPr>
+          <w:rFonts w:ascii="Segoe UI Symbol" w:hAnsi="Segoe UI Symbol" w:cs="Segoe UI Symbol"/>
+          <w:lang w:bidi="fa-IR"/>
+        </w:rPr>
+        <w:t>✅</w:t>
+      </w:r>
+      <w:r>
+        <w:rPr>
+          <w:lang w:bidi="fa-IR"/>
+        </w:rPr>
+        <w:t xml:space="preserve"> </w:t>
+      </w:r>
+      <w:proofErr w:type="spellStart"/>
+      <w:r>
+        <w:rPr>
+          <w:lang w:bidi="fa-IR"/>
+        </w:rPr>
+        <w:t>TagBus</w:t>
+      </w:r>
+      <w:proofErr w:type="spellEnd"/>
+      <w:r>
+        <w:rPr>
+          <w:lang w:bidi="fa-IR"/>
+        </w:rPr>
+        <w:t xml:space="preserve"> </w:t>
+      </w:r>
+      <w:r>
+        <w:rPr>
+          <w:rFonts w:cs="Arial"/>
+          <w:rtl/>
+          <w:lang w:bidi="fa-IR"/>
+        </w:rPr>
+        <w:t>با</w:t>
+      </w:r>
+      <w:r>
+        <w:rPr>
+          <w:lang w:bidi="fa-IR"/>
+        </w:rPr>
+        <w:t xml:space="preserve"> topic</w:t>
+      </w:r>
+      <w:r>
+        <w:rPr>
+          <w:rFonts w:cs="Arial"/>
+          <w:rtl/>
+          <w:lang w:bidi="fa-IR"/>
+        </w:rPr>
+        <w:t>ها</w:t>
+      </w:r>
+      <w:r>
+        <w:rPr>
+          <w:rFonts w:cs="Arial" w:hint="cs"/>
+          <w:rtl/>
+          <w:lang w:bidi="fa-IR"/>
+        </w:rPr>
+        <w:t>ی</w:t>
+      </w:r>
+      <w:r>
+        <w:rPr>
+          <w:lang w:bidi="fa-IR"/>
+        </w:rPr>
+        <w:t xml:space="preserve"> raw/update</w:t>
+      </w:r>
+    </w:p>
+    <w:p>
+      <w:pPr>
+        <w:rPr>
+          <w:lang w:bidi="fa-IR"/>
+        </w:rPr>
+      </w:pPr>
+      <w:r>
+        <w:rPr>
+          <w:rFonts w:ascii="Segoe UI Symbol" w:hAnsi="Segoe UI Symbol" w:cs="Segoe UI Symbol"/>
+          <w:lang w:bidi="fa-IR"/>
+        </w:rPr>
+        <w:t>✅</w:t>
+      </w:r>
+      <w:r>
+        <w:rPr>
+          <w:lang w:bidi="fa-IR"/>
+        </w:rPr>
+        <w:t xml:space="preserve"> Software Filter Chain (7 </w:t>
+      </w:r>
+      <w:r>
+        <w:rPr>
+          <w:rFonts w:cs="Arial"/>
+          <w:rtl/>
+          <w:lang w:bidi="fa-IR"/>
+        </w:rPr>
+        <w:t>ف</w:t>
+      </w:r>
+      <w:r>
+        <w:rPr>
+          <w:rFonts w:cs="Arial" w:hint="cs"/>
+          <w:rtl/>
+          <w:lang w:bidi="fa-IR"/>
+        </w:rPr>
+        <w:t>ی</w:t>
+      </w:r>
+      <w:r>
+        <w:rPr>
+          <w:rFonts w:cs="Arial" w:hint="eastAsia"/>
+          <w:rtl/>
+          <w:lang w:bidi="fa-IR"/>
+        </w:rPr>
+        <w:t>لتر</w:t>
+      </w:r>
+      <w:r>
+        <w:rPr>
+          <w:rFonts w:cs="Arial"/>
+          <w:rtl/>
+          <w:lang w:bidi="fa-IR"/>
+        </w:rPr>
+        <w:t xml:space="preserve"> مختلف</w:t>
+      </w:r>
+      <w:r>
+        <w:rPr>
+          <w:lang w:bidi="fa-IR"/>
+        </w:rPr>
+        <w:t>)</w:t>
+      </w:r>
+    </w:p>
+    <w:p>
+      <w:pPr>
+        <w:rPr>
+          <w:lang w:bidi="fa-IR"/>
+        </w:rPr>
+      </w:pPr>
+      <w:r>
+        <w:rPr>
+          <w:rFonts w:ascii="Segoe UI Symbol" w:hAnsi="Segoe UI Symbol" w:cs="Segoe UI Symbol"/>
+          <w:lang w:bidi="fa-IR"/>
+        </w:rPr>
+        <w:t>✅</w:t>
+      </w:r>
+      <w:r>
+        <w:rPr>
+          <w:lang w:bidi="fa-IR"/>
+        </w:rPr>
+        <w:t xml:space="preserve"> Scaling </w:t>
+      </w:r>
+      <w:r>
+        <w:rPr>
+          <w:rFonts w:cs="Arial"/>
+          <w:rtl/>
+          <w:lang w:bidi="fa-IR"/>
+        </w:rPr>
+        <w:t>با</w:t>
+      </w:r>
+      <w:r>
+        <w:rPr>
+          <w:lang w:bidi="fa-IR"/>
+        </w:rPr>
+        <w:t xml:space="preserve"> Round </w:t>
+      </w:r>
+      <w:r>
+        <w:rPr>
+          <w:rFonts w:cs="Arial"/>
+          <w:rtl/>
+          <w:lang w:bidi="fa-IR"/>
+        </w:rPr>
+        <w:t>کردن</w:t>
+      </w:r>
+    </w:p>
+    <w:p>
+      <w:pPr>
+        <w:rPr>
+          <w:lang w:bidi="fa-IR"/>
+        </w:rPr>
+      </w:pPr>
+      <w:r>
+        <w:rPr>
+          <w:rFonts w:ascii="Segoe UI Symbol" w:hAnsi="Segoe UI Symbol" w:cs="Segoe UI Symbol"/>
+          <w:lang w:bidi="fa-IR"/>
+        </w:rPr>
+        <w:t>✅</w:t>
+      </w:r>
+      <w:r>
+        <w:rPr>
+          <w:lang w:bidi="fa-IR"/>
+        </w:rPr>
+        <w:t xml:space="preserve"> </w:t>
+      </w:r>
+      <w:proofErr w:type="spellStart"/>
+      <w:r>
+        <w:rPr>
+          <w:lang w:bidi="fa-IR"/>
+        </w:rPr>
+        <w:t>Deadband</w:t>
+      </w:r>
+      <w:proofErr w:type="spellEnd"/>
+      <w:r>
+        <w:rPr>
+          <w:lang w:bidi="fa-IR"/>
+        </w:rPr>
+        <w:t xml:space="preserve"> / Storage Exception Filter</w:t>
+      </w:r>
+    </w:p>
+    <w:p>
+      <w:pPr>
+        <w:rPr>
+          <w:lang w:bidi="fa-IR"/>
+        </w:rPr>
+      </w:pPr>
+      <w:r>
+        <w:rPr>
+          <w:rFonts w:ascii="Segoe UI Symbol" w:hAnsi="Segoe UI Symbol" w:cs="Segoe UI Symbol"/>
+          <w:lang w:bidi="fa-IR"/>
+        </w:rPr>
+        <w:t>✅</w:t>
+      </w:r>
+      <w:r>
+        <w:rPr>
+          <w:lang w:bidi="fa-IR"/>
+        </w:rPr>
+        <w:t xml:space="preserve"> Current State Writer (batch)</w:t>
+      </w:r>
+    </w:p>
+    <w:p>
+      <w:pPr>
+        <w:rPr>
+          <w:lang w:bidi="fa-IR"/>
+        </w:rPr>
+      </w:pPr>
+      <w:r>
+        <w:rPr>
+          <w:rFonts w:ascii="Segoe UI Symbol" w:hAnsi="Segoe UI Symbol" w:cs="Segoe UI Symbol"/>
+          <w:lang w:bidi="fa-IR"/>
+        </w:rPr>
+        <w:t>✅</w:t>
+      </w:r>
+      <w:r>
+        <w:rPr>
+          <w:lang w:bidi="fa-IR"/>
+        </w:rPr>
+        <w:t xml:space="preserve"> Batch Historian Writer</w:t>
+      </w:r>
+    </w:p>
+    <w:p>
+      <w:pPr>
+        <w:rPr>
+          <w:lang w:bidi="fa-IR"/>
+        </w:rPr>
+      </w:pPr>
+      <w:r>
+        <w:rPr>
+          <w:rFonts w:ascii="Segoe UI Symbol" w:hAnsi="Segoe UI Symbol" w:cs="Segoe UI Symbol"/>
+          <w:lang w:bidi="fa-IR"/>
+        </w:rPr>
+        <w:t>✅</w:t>
+      </w:r>
+      <w:r>
+        <w:rPr>
+          <w:lang w:bidi="fa-IR"/>
+        </w:rPr>
+        <w:t xml:space="preserve"> Rule Engine </w:t>
+      </w:r>
+      <w:r>
+        <w:rPr>
+          <w:rFonts w:cs="Arial"/>
+          <w:rtl/>
+          <w:lang w:bidi="fa-IR"/>
+        </w:rPr>
+        <w:t>با</w:t>
+      </w:r>
+      <w:r>
+        <w:rPr>
+          <w:lang w:bidi="fa-IR"/>
+        </w:rPr>
+        <w:t xml:space="preserve"> Hysteresis + Delay + Bad Quality</w:t>
+      </w:r>
+    </w:p>
+    <w:p>
+      <w:pPr>
+        <w:rPr>
+          <w:lang w:bidi="fa-IR"/>
+        </w:rPr>
+      </w:pPr>
+      <w:r>
+        <w:rPr>
+          <w:rFonts w:ascii="Segoe UI Symbol" w:hAnsi="Segoe UI Symbol" w:cs="Segoe UI Symbol"/>
+          <w:lang w:bidi="fa-IR"/>
+        </w:rPr>
+        <w:t>✅</w:t>
+      </w:r>
+      <w:r>
+        <w:rPr>
+          <w:lang w:bidi="fa-IR"/>
+        </w:rPr>
+        <w:t xml:space="preserve"> Threshold Rule + Bad Quality Rule</w:t>
+      </w:r>
+    </w:p>
+    <w:p>
+      <w:pPr>
+        <w:rPr>
+          <w:lang w:bidi="fa-IR"/>
+        </w:rPr>
+      </w:pPr>
+      <w:r>
+        <w:rPr>
+          <w:rFonts w:ascii="Segoe UI Symbol" w:hAnsi="Segoe UI Symbol" w:cs="Segoe UI Symbol"/>
+          <w:lang w:bidi="fa-IR"/>
+        </w:rPr>
+        <w:t>✅</w:t>
+      </w:r>
+      <w:r>
+        <w:rPr>
+          <w:lang w:bidi="fa-IR"/>
+        </w:rPr>
+        <w:t xml:space="preserve"> </w:t>
+      </w:r>
+      <w:proofErr w:type="spellStart"/>
+      <w:r>
+        <w:rPr>
+          <w:lang w:bidi="fa-IR"/>
+        </w:rPr>
+        <w:t>ITagDriver</w:t>
+      </w:r>
+      <w:proofErr w:type="spellEnd"/>
+      <w:r>
+        <w:rPr>
+          <w:lang w:bidi="fa-IR"/>
+        </w:rPr>
+        <w:t xml:space="preserve"> Interface</w:t>
+      </w:r>
+    </w:p>
+    <w:p>
+      <w:pPr>
+        <w:rPr>
+          <w:lang w:bidi="fa-IR"/>
+        </w:rPr>
+      </w:pPr>
+      <w:r>
+        <w:rPr>
+          <w:rFonts w:ascii="Segoe UI Symbol" w:hAnsi="Segoe UI Symbol" w:cs="Segoe UI Symbol"/>
+          <w:lang w:bidi="fa-IR"/>
+        </w:rPr>
+        <w:t>✅</w:t>
+      </w:r>
+      <w:r>
+        <w:rPr>
+          <w:lang w:bidi="fa-IR"/>
+        </w:rPr>
+        <w:t xml:space="preserve"> </w:t>
+      </w:r>
+      <w:proofErr w:type="spellStart"/>
+      <w:r>
+        <w:rPr>
+          <w:lang w:bidi="fa-IR"/>
+        </w:rPr>
+        <w:t>DriverManager</w:t>
+      </w:r>
+      <w:proofErr w:type="spellEnd"/>
+    </w:p>
+    <w:p>
+      <w:pPr>
+        <w:rPr>
+          <w:lang w:bidi="fa-IR"/>
+        </w:rPr>
+      </w:pPr>
+      <w:r>
+        <w:rPr>
+          <w:rFonts w:ascii="Segoe UI Symbol" w:hAnsi="Segoe UI Symbol" w:cs="Segoe UI Symbol"/>
+          <w:lang w:bidi="fa-IR"/>
+        </w:rPr>
+        <w:t>✅</w:t>
+      </w:r>
+      <w:r>
+        <w:rPr>
+          <w:lang w:bidi="fa-IR"/>
+        </w:rPr>
+        <w:t xml:space="preserve"> </w:t>
+      </w:r>
+      <w:proofErr w:type="spellStart"/>
+      <w:r>
+        <w:rPr>
+          <w:lang w:bidi="fa-IR"/>
+        </w:rPr>
+        <w:t>DriverFactory</w:t>
+      </w:r>
+      <w:proofErr w:type="spellEnd"/>
+    </w:p>
+    <w:p>
+      <w:pPr>
+        <w:rPr>
+          <w:lang w:bidi="fa-IR"/>
+        </w:rPr>
+      </w:pPr>
+      <w:r>
+        <w:rPr>
+          <w:rFonts w:ascii="Segoe UI Symbol" w:hAnsi="Segoe UI Symbol" w:cs="Segoe UI Symbol"/>
+          <w:lang w:bidi="fa-IR"/>
+        </w:rPr>
+        <w:t>✅</w:t>
+      </w:r>
+      <w:r>
+        <w:rPr>
+          <w:lang w:bidi="fa-IR"/>
+        </w:rPr>
+        <w:t xml:space="preserve"> </w:t>
+      </w:r>
+      <w:proofErr w:type="spellStart"/>
+      <w:r>
+        <w:rPr>
+          <w:lang w:bidi="fa-IR"/>
+        </w:rPr>
+        <w:t>SimulatorDriver</w:t>
+      </w:r>
+      <w:proofErr w:type="spellEnd"/>
+      <w:r>
+        <w:rPr>
+          <w:lang w:bidi="fa-IR"/>
+        </w:rPr>
+        <w:t xml:space="preserve"> (Adapter)</w:t>
+      </w:r>
+    </w:p>
+    <w:p>
+      <w:pPr>
+        <w:rPr>
+          <w:lang w:bidi="fa-IR"/>
+        </w:rPr>
+      </w:pPr>
+      <w:r>
+        <w:rPr>
+          <w:rFonts w:ascii="Segoe UI Symbol" w:hAnsi="Segoe UI Symbol" w:cs="Segoe UI Symbol"/>
+          <w:lang w:bidi="fa-IR"/>
+        </w:rPr>
+        <w:t>✅</w:t>
+      </w:r>
+      <w:r>
+        <w:rPr>
+          <w:lang w:bidi="fa-IR"/>
+        </w:rPr>
+        <w:t xml:space="preserve"> Modbus TCP Driver (</w:t>
+      </w:r>
+      <w:r>
+        <w:rPr>
+          <w:rFonts w:cs="Arial"/>
+          <w:rtl/>
+          <w:lang w:bidi="fa-IR"/>
+        </w:rPr>
+        <w:t>با</w:t>
+      </w:r>
+      <w:r>
+        <w:rPr>
+          <w:lang w:bidi="fa-IR"/>
+        </w:rPr>
+        <w:t xml:space="preserve"> polling</w:t>
+      </w:r>
+      <w:r>
+        <w:rPr>
+          <w:rFonts w:cs="Arial"/>
+          <w:rtl/>
+          <w:lang w:bidi="fa-IR"/>
+        </w:rPr>
+        <w:t xml:space="preserve">، </w:t>
+      </w:r>
+      <w:r>
+        <w:rPr>
+          <w:lang w:bidi="fa-IR"/>
+        </w:rPr>
+        <w:t>timeout</w:t>
+      </w:r>
+      <w:r>
+        <w:rPr>
+          <w:rFonts w:cs="Arial"/>
+          <w:rtl/>
+          <w:lang w:bidi="fa-IR"/>
+        </w:rPr>
+        <w:t xml:space="preserve">، </w:t>
+      </w:r>
+      <w:r>
+        <w:rPr>
+          <w:lang w:bidi="fa-IR"/>
+        </w:rPr>
+        <w:t>reconnect</w:t>
+      </w:r>
+      <w:r>
+        <w:rPr>
+          <w:rFonts w:cs="Arial"/>
+          <w:rtl/>
+          <w:lang w:bidi="fa-IR"/>
+        </w:rPr>
+        <w:t xml:space="preserve">، </w:t>
+      </w:r>
+      <w:r>
+        <w:rPr>
+          <w:lang w:bidi="fa-IR"/>
+        </w:rPr>
+        <w:t>debug)</w:t>
+      </w:r>
+    </w:p>
+    <w:p>
+      <w:pPr>
+        <w:rPr>
+          <w:lang w:bidi="fa-IR"/>
+        </w:rPr>
+      </w:pPr>
+    </w:p>
+    <w:p>
+      <w:pPr>
+        <w:rPr>
+          <w:lang w:bidi="fa-IR"/>
+        </w:rPr>
+      </w:pPr>
+      <w:r>
+        <w:rPr>
+          <w:lang w:bidi="fa-IR"/>
+        </w:rPr>
+        <w:lastRenderedPageBreak/>
+        <w:drawing>
+          <wp:inline distT="0" distB="0" distL="0" distR="0" wp14:anchorId="09836B16" wp14:editId="7418815C">
+            <wp:extent cx="5943600" cy="3997325"/>
+            <wp:effectExtent l="0" t="0" r="0" b="3175"/>
+            <wp:docPr id="1" name="Picture 1"/>
+            <wp:cNvGraphicFramePr>
+              <a:graphicFrameLocks xmlns:a="http://schemas.openxmlformats.org/drawingml/2006/main" noChangeAspect="1"/>
+            </wp:cNvGraphicFramePr>
+            <a:graphic xmlns:a="http://schemas.openxmlformats.org/drawingml/2006/main">
+              <a:graphicData uri="http://schemas.openxmlformats.org/drawingml/2006/picture">
+                <pic:pic xmlns:pic="http://schemas.openxmlformats.org/drawingml/2006/picture">
+                  <pic:nvPicPr>
+                    <pic:cNvPr id="1" name=""/>
+                    <pic:cNvPicPr/>
+                  </pic:nvPicPr>
+                  <pic:blipFill>
+                    <a:blip r:embed="rId4"/>
+                    <a:stretch>
+                      <a:fillRect/>
+                    </a:stretch>
+                  </pic:blipFill>
+                  <pic:spPr>
+                    <a:xfrm>
+                      <a:off x="0" y="0"/>
+                      <a:ext cx="5943600" cy="3997325"/>
+                    </a:xfrm>
+                    <a:prstGeom prst="rect">
+                      <a:avLst/>
+                    </a:prstGeom>
+                  </pic:spPr>
+                </pic:pic>
+              </a:graphicData>
+            </a:graphic>
+          </wp:inline>
+        </w:drawing>
+      </w:r>
+    </w:p>
+    <w:p>
+      <w:pPr>
+        <w:rPr>
+          <w:lang w:bidi="fa-IR"/>
+        </w:rPr>
+      </w:pPr>
+    </w:p>
+    <w:p>
+      <w:pPr>
+        <w:pBdr>
+          <w:top w:val="single" w:sz="2" w:space="0" w:color="E3E3E3"/>
+          <w:left w:val="single" w:sz="2" w:space="0" w:color="E3E3E3"/>
+          <w:bottom w:val="single" w:sz="2" w:space="0" w:color="E3E3E3"/>
+          <w:right w:val="single" w:sz="2" w:space="0" w:color="E3E3E3"/>
+        </w:pBdr>
+        <w:shd w:val="clear" w:color="auto" w:fill="FFFFFF"/>
+        <w:bidi/>
+        <w:spacing w:beforeAutospacing="1" w:after="0" w:afterAutospacing="1" w:line="240" w:lineRule="auto"/>
+        <w:outlineLvl w:val="1"/>
+        <w:rPr>
+          <w:rFonts w:ascii="Arial" w:eastAsia="Times New Roman" w:hAnsi="Arial" w:cs="Arial"/>
+          <w:color w:val="1D1D1F"/>
+          <w:spacing w:val="-5"/>
+          <w:sz w:val="28"/>
+          <w:szCs w:val="28"/>
+          <w:bdr w:val="single" w:sz="2" w:space="0" w:color="E3E3E3" w:frame="1"/>
+        </w:rPr>
+      </w:pPr>
+      <w:r>
+        <w:rPr>
+          <w:rFonts w:ascii="Arial" w:eastAsia="Times New Roman" w:hAnsi="Arial" w:cs="Arial"/>
+          <w:b/>
+          <w:bCs/>
+          <w:color w:val="1D1D1F"/>
+          <w:spacing w:val="-5"/>
+          <w:sz w:val="36"/>
+          <w:szCs w:val="36"/>
+          <w:bdr w:val="single" w:sz="2" w:space="0" w:color="E3E3E3" w:frame="1"/>
+          <w:rtl/>
+        </w:rPr>
+        <w:t xml:space="preserve">مسیر 1: تکمیل </w:t>
+      </w:r>
+      <w:r>
+        <w:rPr>
+          <w:rFonts w:ascii="Arial" w:eastAsia="Times New Roman" w:hAnsi="Arial" w:cs="Arial"/>
+          <w:b/>
+          <w:bCs/>
+          <w:color w:val="1D1D1F"/>
+          <w:spacing w:val="-5"/>
+          <w:sz w:val="36"/>
+          <w:szCs w:val="36"/>
+          <w:bdr w:val="single" w:sz="2" w:space="0" w:color="E3E3E3" w:frame="1"/>
+        </w:rPr>
+        <w:t>Rule Engine</w:t>
+      </w:r>
+    </w:p>
+    <w:p>
+      <w:pPr>
+        <w:pBdr>
+          <w:top w:val="single" w:sz="2" w:space="0" w:color="E3E3E3"/>
+          <w:left w:val="single" w:sz="2" w:space="0" w:color="E3E3E3"/>
+          <w:bottom w:val="single" w:sz="2" w:space="0" w:color="E3E3E3"/>
+          <w:right w:val="single" w:sz="2" w:space="0" w:color="E3E3E3"/>
+        </w:pBdr>
+        <w:shd w:val="clear" w:color="auto" w:fill="FFFFFF"/>
+        <w:bidi/>
+        <w:spacing w:beforeAutospacing="1" w:after="0" w:afterAutospacing="1" w:line="240" w:lineRule="auto"/>
+        <w:outlineLvl w:val="1"/>
+        <w:rPr>
+          <w:rFonts w:ascii="Arial" w:eastAsia="Times New Roman" w:hAnsi="Arial" w:cs="Arial"/>
+          <w:color w:val="1D1D1F"/>
+          <w:spacing w:val="-5"/>
+          <w:sz w:val="28"/>
+          <w:szCs w:val="28"/>
+        </w:rPr>
+      </w:pPr>
+      <w:proofErr w:type="spellStart"/>
+      <w:r>
+        <w:rPr>
+          <w:rFonts w:ascii="Arial" w:eastAsia="Times New Roman" w:hAnsi="Arial" w:cs="Arial"/>
+          <w:color w:val="1D1D1F"/>
+          <w:spacing w:val="-5"/>
+          <w:sz w:val="28"/>
+          <w:szCs w:val="28"/>
+        </w:rPr>
+        <w:t>HighHigh</w:t>
+      </w:r>
+      <w:proofErr w:type="spellEnd"/>
+      <w:r>
+        <w:rPr>
+          <w:rFonts w:ascii="Arial" w:eastAsia="Times New Roman" w:hAnsi="Arial" w:cs="Arial"/>
+          <w:color w:val="1D1D1F"/>
+          <w:spacing w:val="-5"/>
+          <w:sz w:val="28"/>
+          <w:szCs w:val="28"/>
+        </w:rPr>
+        <w:t xml:space="preserve"> / </w:t>
+      </w:r>
+      <w:proofErr w:type="spellStart"/>
+      <w:r>
+        <w:rPr>
+          <w:rFonts w:ascii="Arial" w:eastAsia="Times New Roman" w:hAnsi="Arial" w:cs="Arial"/>
+          <w:color w:val="1D1D1F"/>
+          <w:spacing w:val="-5"/>
+          <w:sz w:val="28"/>
+          <w:szCs w:val="28"/>
+        </w:rPr>
+        <w:t>LowLow</w:t>
+      </w:r>
+      <w:proofErr w:type="spellEnd"/>
+      <w:r>
+        <w:rPr>
+          <w:rFonts w:ascii="Arial" w:eastAsia="Times New Roman" w:hAnsi="Arial" w:cs="Arial"/>
+          <w:color w:val="1D1D1F"/>
+          <w:spacing w:val="-5"/>
+          <w:sz w:val="28"/>
+          <w:szCs w:val="28"/>
+          <w:rtl/>
+        </w:rPr>
+        <w:t xml:space="preserve"> با </w:t>
+      </w:r>
+      <w:r>
+        <w:rPr>
+          <w:rFonts w:ascii="Arial" w:eastAsia="Times New Roman" w:hAnsi="Arial" w:cs="Arial"/>
+          <w:color w:val="1D1D1F"/>
+          <w:spacing w:val="-5"/>
+          <w:sz w:val="28"/>
+          <w:szCs w:val="28"/>
+        </w:rPr>
+        <w:t>severity</w:t>
+      </w:r>
+    </w:p>
+    <w:p>
+      <w:pPr>
+        <w:pBdr>
+          <w:top w:val="single" w:sz="2" w:space="0" w:color="E3E3E3"/>
+          <w:left w:val="single" w:sz="2" w:space="0" w:color="E3E3E3"/>
+          <w:bottom w:val="single" w:sz="2" w:space="0" w:color="E3E3E3"/>
+          <w:right w:val="single" w:sz="2" w:space="0" w:color="E3E3E3"/>
+        </w:pBdr>
+        <w:shd w:val="clear" w:color="auto" w:fill="FFFFFF"/>
+        <w:bidi/>
+        <w:spacing w:beforeAutospacing="1" w:after="0" w:afterAutospacing="1" w:line="240" w:lineRule="auto"/>
+        <w:outlineLvl w:val="1"/>
+        <w:rPr>
+          <w:rFonts w:ascii="Arial" w:eastAsia="Times New Roman" w:hAnsi="Arial" w:cs="Arial"/>
+          <w:color w:val="1D1D1F"/>
+          <w:spacing w:val="-5"/>
+          <w:sz w:val="28"/>
+          <w:szCs w:val="28"/>
+        </w:rPr>
+      </w:pPr>
       <w:bookmarkStart w:id="0" w:name="_GoBack"/>
-      <w:bookmarkEnd w:id="0"/>
+      <w:r>
+        <w:rPr>
+          <w:rFonts w:ascii="Arial" w:eastAsia="Times New Roman" w:hAnsi="Arial" w:cs="Arial"/>
+          <w:color w:val="1D1D1F"/>
+          <w:spacing w:val="-5"/>
+          <w:sz w:val="28"/>
+          <w:szCs w:val="28"/>
+        </w:rPr>
+        <w:t>Alarm Events Table</w:t>
+      </w:r>
+    </w:p>
+    <w:bookmarkEnd w:id="0"/>
+    <w:p>
+      <w:pPr>
+        <w:pBdr>
+          <w:top w:val="single" w:sz="2" w:space="0" w:color="E3E3E3"/>
+          <w:left w:val="single" w:sz="2" w:space="0" w:color="E3E3E3"/>
+          <w:bottom w:val="single" w:sz="2" w:space="0" w:color="E3E3E3"/>
+          <w:right w:val="single" w:sz="2" w:space="0" w:color="E3E3E3"/>
+        </w:pBdr>
+        <w:shd w:val="clear" w:color="auto" w:fill="FFFFFF"/>
+        <w:bidi/>
+        <w:spacing w:beforeAutospacing="1" w:after="0" w:afterAutospacing="1" w:line="240" w:lineRule="auto"/>
+        <w:outlineLvl w:val="1"/>
+        <w:rPr>
+          <w:rFonts w:ascii="Arial" w:eastAsia="Times New Roman" w:hAnsi="Arial" w:cs="Arial"/>
+          <w:color w:val="1D1D1F"/>
+          <w:spacing w:val="-5"/>
+          <w:sz w:val="28"/>
+          <w:szCs w:val="28"/>
+        </w:rPr>
+      </w:pPr>
+      <w:r>
+        <w:rPr>
+          <w:rFonts w:ascii="Arial" w:eastAsia="Times New Roman" w:hAnsi="Arial" w:cs="Arial"/>
+          <w:color w:val="1D1D1F"/>
+          <w:spacing w:val="-5"/>
+          <w:sz w:val="28"/>
+          <w:szCs w:val="28"/>
+        </w:rPr>
+        <w:t>Alarm Acknowledgment</w:t>
+      </w:r>
+    </w:p>
+    <w:p>
+      <w:pPr>
+        <w:pBdr>
+          <w:top w:val="single" w:sz="2" w:space="0" w:color="E3E3E3"/>
+          <w:left w:val="single" w:sz="2" w:space="0" w:color="E3E3E3"/>
+          <w:bottom w:val="single" w:sz="2" w:space="0" w:color="E3E3E3"/>
+          <w:right w:val="single" w:sz="2" w:space="0" w:color="E3E3E3"/>
+        </w:pBdr>
+        <w:shd w:val="clear" w:color="auto" w:fill="FFFFFF"/>
+        <w:bidi/>
+        <w:spacing w:beforeAutospacing="1" w:after="0" w:afterAutospacing="1" w:line="240" w:lineRule="auto"/>
+        <w:outlineLvl w:val="1"/>
+        <w:rPr>
+          <w:rFonts w:ascii="Arial" w:eastAsia="Times New Roman" w:hAnsi="Arial" w:cs="Arial"/>
+          <w:color w:val="1D1D1F"/>
+          <w:spacing w:val="-5"/>
+          <w:sz w:val="28"/>
+          <w:szCs w:val="28"/>
+        </w:rPr>
+      </w:pPr>
+      <w:r>
+        <w:rPr>
+          <w:rFonts w:ascii="Arial" w:eastAsia="Times New Roman" w:hAnsi="Arial" w:cs="Arial"/>
+          <w:color w:val="1D1D1F"/>
+          <w:spacing w:val="-5"/>
+          <w:sz w:val="28"/>
+          <w:szCs w:val="28"/>
+        </w:rPr>
+        <w:t>Alarm State Machine</w:t>
+      </w:r>
+      <w:r>
+        <w:rPr>
+          <w:rFonts w:ascii="Arial" w:eastAsia="Times New Roman" w:hAnsi="Arial" w:cs="Arial"/>
+          <w:color w:val="1D1D1F"/>
+          <w:spacing w:val="-5"/>
+          <w:sz w:val="28"/>
+          <w:szCs w:val="28"/>
+          <w:rtl/>
+        </w:rPr>
+        <w:t xml:space="preserve"> بهبود</w:t>
+      </w:r>
+      <w:r>
+        <w:rPr>
+          <w:rFonts w:ascii="Arial" w:eastAsia="Times New Roman" w:hAnsi="Arial" w:cs="Arial" w:hint="cs"/>
+          <w:color w:val="1D1D1F"/>
+          <w:spacing w:val="-5"/>
+          <w:sz w:val="28"/>
+          <w:szCs w:val="28"/>
+          <w:rtl/>
+        </w:rPr>
+        <w:t>ی</w:t>
+      </w:r>
+      <w:r>
+        <w:rPr>
+          <w:rFonts w:ascii="Arial" w:eastAsia="Times New Roman" w:hAnsi="Arial" w:cs="Arial" w:hint="eastAsia"/>
+          <w:color w:val="1D1D1F"/>
+          <w:spacing w:val="-5"/>
+          <w:sz w:val="28"/>
+          <w:szCs w:val="28"/>
+          <w:rtl/>
+        </w:rPr>
+        <w:t>افته</w:t>
+      </w:r>
+    </w:p>
+    <w:p>
+      <w:pPr>
+        <w:pBdr>
+          <w:top w:val="single" w:sz="2" w:space="0" w:color="E3E3E3"/>
+          <w:left w:val="single" w:sz="2" w:space="0" w:color="E3E3E3"/>
+          <w:bottom w:val="single" w:sz="2" w:space="0" w:color="E3E3E3"/>
+          <w:right w:val="single" w:sz="2" w:space="0" w:color="E3E3E3"/>
+        </w:pBdr>
+        <w:shd w:val="clear" w:color="auto" w:fill="FFFFFF"/>
+        <w:bidi/>
+        <w:spacing w:beforeAutospacing="1" w:after="0" w:afterAutospacing="1" w:line="240" w:lineRule="auto"/>
+        <w:outlineLvl w:val="1"/>
+        <w:rPr>
+          <w:rFonts w:ascii="Arial" w:eastAsia="Times New Roman" w:hAnsi="Arial" w:cs="Arial"/>
+          <w:color w:val="1D1D1F"/>
+          <w:spacing w:val="-5"/>
+          <w:sz w:val="28"/>
+          <w:szCs w:val="28"/>
+        </w:rPr>
+      </w:pPr>
+      <w:proofErr w:type="spellStart"/>
+      <w:r>
+        <w:rPr>
+          <w:rFonts w:ascii="Arial" w:eastAsia="Times New Roman" w:hAnsi="Arial" w:cs="Arial"/>
+          <w:color w:val="1D1D1F"/>
+          <w:spacing w:val="-5"/>
+          <w:sz w:val="28"/>
+          <w:szCs w:val="28"/>
+        </w:rPr>
+        <w:t>Config</w:t>
+      </w:r>
+      <w:proofErr w:type="spellEnd"/>
+      <w:r>
+        <w:rPr>
+          <w:rFonts w:ascii="Arial" w:eastAsia="Times New Roman" w:hAnsi="Arial" w:cs="Arial"/>
+          <w:color w:val="1D1D1F"/>
+          <w:spacing w:val="-5"/>
+          <w:sz w:val="28"/>
+          <w:szCs w:val="28"/>
+          <w:rtl/>
+        </w:rPr>
+        <w:t xml:space="preserve"> در </w:t>
+      </w:r>
+      <w:r>
+        <w:rPr>
+          <w:rFonts w:ascii="Arial" w:eastAsia="Times New Roman" w:hAnsi="Arial" w:cs="Arial"/>
+          <w:color w:val="1D1D1F"/>
+          <w:spacing w:val="-5"/>
+          <w:sz w:val="28"/>
+          <w:szCs w:val="28"/>
+        </w:rPr>
+        <w:t>DB</w:t>
+      </w:r>
+    </w:p>
+    <w:p>
+      <w:pPr>
+        <w:pStyle w:val="Heading2"/>
+        <w:pBdr>
+          <w:top w:val="single" w:sz="2" w:space="0" w:color="E3E3E3"/>
+          <w:left w:val="single" w:sz="2" w:space="0" w:color="E3E3E3"/>
+          <w:bottom w:val="single" w:sz="2" w:space="0" w:color="E3E3E3"/>
+          <w:right w:val="single" w:sz="2" w:space="0" w:color="E3E3E3"/>
+        </w:pBdr>
+        <w:shd w:val="clear" w:color="auto" w:fill="FFFFFF"/>
+        <w:bidi/>
+        <w:spacing w:before="0" w:after="0"/>
+        <w:rPr>
+          <w:rFonts w:ascii="Arial" w:hAnsi="Arial" w:cs="Arial"/>
+          <w:color w:val="1D1D1F"/>
+          <w:spacing w:val="-5"/>
+        </w:rPr>
+      </w:pPr>
+      <w:r>
+        <w:rPr>
+          <w:rStyle w:val="qwen-markdown-text"/>
+          <w:rFonts w:ascii="Arial" w:hAnsi="Arial" w:cs="Arial"/>
+          <w:color w:val="1D1D1F"/>
+          <w:spacing w:val="-5"/>
+          <w:bdr w:val="single" w:sz="2" w:space="0" w:color="E3E3E3" w:frame="1"/>
+          <w:rtl/>
+        </w:rPr>
+        <w:t xml:space="preserve">مسیر 2: </w:t>
+      </w:r>
+      <w:r>
+        <w:rPr>
+          <w:rStyle w:val="qwen-markdown-text"/>
+          <w:rFonts w:ascii="Arial" w:hAnsi="Arial" w:cs="Arial"/>
+          <w:color w:val="1D1D1F"/>
+          <w:spacing w:val="-5"/>
+          <w:bdr w:val="single" w:sz="2" w:space="0" w:color="E3E3E3" w:frame="1"/>
+        </w:rPr>
+        <w:t>Modbus Write</w:t>
+      </w:r>
+    </w:p>
+    <w:p>
+      <w:pPr>
+        <w:pStyle w:val="Heading2"/>
+        <w:pBdr>
+          <w:top w:val="single" w:sz="2" w:space="0" w:color="E3E3E3"/>
+          <w:left w:val="single" w:sz="2" w:space="0" w:color="E3E3E3"/>
+          <w:bottom w:val="single" w:sz="2" w:space="0" w:color="E3E3E3"/>
+          <w:right w:val="single" w:sz="2" w:space="0" w:color="E3E3E3"/>
+        </w:pBdr>
+        <w:shd w:val="clear" w:color="auto" w:fill="FFFFFF"/>
+        <w:bidi/>
+        <w:spacing w:before="0" w:after="0"/>
+        <w:rPr>
+          <w:rFonts w:ascii="Arial" w:hAnsi="Arial" w:cs="Arial"/>
+          <w:color w:val="1D1D1F"/>
+          <w:spacing w:val="-5"/>
+        </w:rPr>
+      </w:pPr>
+      <w:r>
+        <w:rPr>
+          <w:rStyle w:val="qwen-markdown-text"/>
+          <w:rFonts w:ascii="Arial" w:hAnsi="Arial" w:cs="Arial"/>
+          <w:color w:val="1D1D1F"/>
+          <w:spacing w:val="-5"/>
+          <w:bdr w:val="single" w:sz="2" w:space="0" w:color="E3E3E3" w:frame="1"/>
+          <w:rtl/>
+        </w:rPr>
+        <w:t xml:space="preserve">مسیر 3: </w:t>
+      </w:r>
+      <w:r>
+        <w:rPr>
+          <w:rStyle w:val="qwen-markdown-text"/>
+          <w:rFonts w:ascii="Arial" w:hAnsi="Arial" w:cs="Arial"/>
+          <w:color w:val="1D1D1F"/>
+          <w:spacing w:val="-5"/>
+          <w:bdr w:val="single" w:sz="2" w:space="0" w:color="E3E3E3" w:frame="1"/>
+        </w:rPr>
+        <w:t>Modbus RTU Driver</w:t>
+      </w:r>
+    </w:p>
+    <w:p>
+      <w:pPr>
+        <w:pStyle w:val="Heading2"/>
+        <w:pBdr>
+          <w:top w:val="single" w:sz="2" w:space="0" w:color="E3E3E3"/>
+          <w:left w:val="single" w:sz="2" w:space="0" w:color="E3E3E3"/>
+          <w:bottom w:val="single" w:sz="2" w:space="0" w:color="E3E3E3"/>
+          <w:right w:val="single" w:sz="2" w:space="0" w:color="E3E3E3"/>
+        </w:pBdr>
+        <w:shd w:val="clear" w:color="auto" w:fill="FFFFFF"/>
+        <w:bidi/>
+        <w:spacing w:before="0" w:after="0"/>
+        <w:rPr>
+          <w:rFonts w:ascii="Arial" w:hAnsi="Arial" w:cs="Arial"/>
+          <w:color w:val="1D1D1F"/>
+          <w:spacing w:val="-5"/>
+        </w:rPr>
+      </w:pPr>
+      <w:r>
+        <w:rPr>
+          <w:rStyle w:val="qwen-markdown-text"/>
+          <w:rFonts w:ascii="Arial" w:hAnsi="Arial" w:cs="Arial"/>
+          <w:color w:val="1D1D1F"/>
+          <w:spacing w:val="-5"/>
+          <w:bdr w:val="single" w:sz="2" w:space="0" w:color="E3E3E3" w:frame="1"/>
+          <w:rtl/>
+        </w:rPr>
+        <w:t xml:space="preserve">مسیر 4: </w:t>
+      </w:r>
+      <w:r>
+        <w:rPr>
+          <w:rStyle w:val="qwen-markdown-text"/>
+          <w:rFonts w:ascii="Arial" w:hAnsi="Arial" w:cs="Arial"/>
+          <w:color w:val="1D1D1F"/>
+          <w:spacing w:val="-5"/>
+          <w:bdr w:val="single" w:sz="2" w:space="0" w:color="E3E3E3" w:frame="1"/>
+        </w:rPr>
+        <w:t xml:space="preserve">Notification / </w:t>
+      </w:r>
+      <w:proofErr w:type="spellStart"/>
+      <w:r>
+        <w:rPr>
+          <w:rStyle w:val="qwen-markdown-text"/>
+          <w:rFonts w:ascii="Arial" w:hAnsi="Arial" w:cs="Arial"/>
+          <w:color w:val="1D1D1F"/>
+          <w:spacing w:val="-5"/>
+          <w:bdr w:val="single" w:sz="2" w:space="0" w:color="E3E3E3" w:frame="1"/>
+        </w:rPr>
+        <w:t>Webhook</w:t>
+      </w:r>
+      <w:proofErr w:type="spellEnd"/>
+    </w:p>
+    <w:p>
+      <w:pPr>
+        <w:pStyle w:val="Heading2"/>
+        <w:pBdr>
+          <w:top w:val="single" w:sz="2" w:space="0" w:color="E3E3E3"/>
+          <w:left w:val="single" w:sz="2" w:space="0" w:color="E3E3E3"/>
+          <w:bottom w:val="single" w:sz="2" w:space="0" w:color="E3E3E3"/>
+          <w:right w:val="single" w:sz="2" w:space="0" w:color="E3E3E3"/>
+        </w:pBdr>
+        <w:shd w:val="clear" w:color="auto" w:fill="FFFFFF"/>
+        <w:bidi/>
+        <w:spacing w:before="0" w:after="0"/>
+        <w:rPr>
+          <w:rFonts w:ascii="Arial" w:hAnsi="Arial" w:cs="Arial"/>
+          <w:color w:val="1D1D1F"/>
+          <w:spacing w:val="-5"/>
+        </w:rPr>
+      </w:pPr>
+      <w:r>
+        <w:rPr>
+          <w:rStyle w:val="qwen-markdown-text"/>
+          <w:rFonts w:ascii="Arial" w:hAnsi="Arial" w:cs="Arial"/>
+          <w:color w:val="1D1D1F"/>
+          <w:spacing w:val="-5"/>
+          <w:bdr w:val="single" w:sz="2" w:space="0" w:color="E3E3E3" w:frame="1"/>
+          <w:rtl/>
+        </w:rPr>
+        <w:lastRenderedPageBreak/>
+        <w:t xml:space="preserve">مسیر 5: </w:t>
+      </w:r>
+      <w:r>
+        <w:rPr>
+          <w:rStyle w:val="qwen-markdown-text"/>
+          <w:rFonts w:ascii="Arial" w:hAnsi="Arial" w:cs="Arial"/>
+          <w:color w:val="1D1D1F"/>
+          <w:spacing w:val="-5"/>
+          <w:bdr w:val="single" w:sz="2" w:space="0" w:color="E3E3E3" w:frame="1"/>
+        </w:rPr>
+        <w:t>MQTT Driver</w:t>
+      </w:r>
+    </w:p>
+    <w:p>
+      <w:pPr>
+        <w:pStyle w:val="Heading2"/>
+        <w:pBdr>
+          <w:top w:val="single" w:sz="2" w:space="0" w:color="E3E3E3"/>
+          <w:left w:val="single" w:sz="2" w:space="0" w:color="E3E3E3"/>
+          <w:bottom w:val="single" w:sz="2" w:space="0" w:color="E3E3E3"/>
+          <w:right w:val="single" w:sz="2" w:space="0" w:color="E3E3E3"/>
+        </w:pBdr>
+        <w:shd w:val="clear" w:color="auto" w:fill="FFFFFF"/>
+        <w:bidi/>
+        <w:spacing w:before="0" w:after="0"/>
+        <w:rPr>
+          <w:rFonts w:ascii="Arial" w:hAnsi="Arial" w:cs="Arial"/>
+          <w:color w:val="1D1D1F"/>
+          <w:spacing w:val="-5"/>
+        </w:rPr>
+      </w:pPr>
+      <w:r>
+        <w:rPr>
+          <w:rStyle w:val="qwen-markdown-text"/>
+          <w:rFonts w:ascii="Arial" w:hAnsi="Arial" w:cs="Arial"/>
+          <w:color w:val="1D1D1F"/>
+          <w:spacing w:val="-5"/>
+          <w:bdr w:val="single" w:sz="2" w:space="0" w:color="E3E3E3" w:frame="1"/>
+          <w:rtl/>
+        </w:rPr>
+        <w:t xml:space="preserve">مسیر 6: </w:t>
+      </w:r>
+      <w:r>
+        <w:rPr>
+          <w:rStyle w:val="qwen-markdown-text"/>
+          <w:rFonts w:ascii="Arial" w:hAnsi="Arial" w:cs="Arial"/>
+          <w:color w:val="1D1D1F"/>
+          <w:spacing w:val="-5"/>
+          <w:bdr w:val="single" w:sz="2" w:space="0" w:color="E3E3E3" w:frame="1"/>
+        </w:rPr>
+        <w:t>OPC UA Driver</w:t>
+      </w:r>
+    </w:p>
+    <w:p>
+      <w:pPr>
+        <w:pStyle w:val="Heading2"/>
+        <w:pBdr>
+          <w:top w:val="single" w:sz="2" w:space="0" w:color="E3E3E3"/>
+          <w:left w:val="single" w:sz="2" w:space="0" w:color="E3E3E3"/>
+          <w:bottom w:val="single" w:sz="2" w:space="0" w:color="E3E3E3"/>
+          <w:right w:val="single" w:sz="2" w:space="0" w:color="E3E3E3"/>
+        </w:pBdr>
+        <w:shd w:val="clear" w:color="auto" w:fill="FFFFFF"/>
+        <w:bidi/>
+        <w:spacing w:before="0" w:after="0"/>
+        <w:rPr>
+          <w:rFonts w:ascii="Arial" w:hAnsi="Arial" w:cs="Arial"/>
+          <w:color w:val="1D1D1F"/>
+          <w:spacing w:val="-5"/>
+        </w:rPr>
+      </w:pPr>
+      <w:r>
+        <w:rPr>
+          <w:rStyle w:val="qwen-markdown-text"/>
+          <w:rFonts w:ascii="Arial" w:hAnsi="Arial" w:cs="Arial"/>
+          <w:color w:val="1D1D1F"/>
+          <w:spacing w:val="-5"/>
+          <w:bdr w:val="single" w:sz="2" w:space="0" w:color="E3E3E3" w:frame="1"/>
+          <w:rtl/>
+        </w:rPr>
+        <w:t xml:space="preserve">مسیر 7: </w:t>
+      </w:r>
+      <w:r>
+        <w:rPr>
+          <w:rStyle w:val="qwen-markdown-text"/>
+          <w:rFonts w:ascii="Arial" w:hAnsi="Arial" w:cs="Arial"/>
+          <w:color w:val="1D1D1F"/>
+          <w:spacing w:val="-5"/>
+          <w:bdr w:val="single" w:sz="2" w:space="0" w:color="E3E3E3" w:frame="1"/>
+        </w:rPr>
+        <w:t>Computed Tags</w:t>
+      </w:r>
+    </w:p>
+    <w:p>
+      <w:pPr>
+        <w:rPr>
+          <w:lang w:bidi="fa-IR"/>
+        </w:rPr>
+      </w:pPr>
     </w:p>
     <w:sectPr>
       <w:pgSz w:w="12240" w:h="15840"/>
@@ -591,6 +1866,25 @@
     <w:name w:val="Normal"/>
     <w:qFormat/>
   </w:style>
+  <w:style w:type="paragraph" w:styleId="Heading2">
+    <w:name w:val="heading 2"/>
+    <w:basedOn w:val="Normal"/>
+    <w:link w:val="Heading2Char"/>
+    <w:uiPriority w:val="9"/>
+    <w:qFormat/>
+    <w:rsid w:val="00266B96"/>
+    <w:pPr>
+      <w:spacing w:before="100" w:beforeAutospacing="1" w:after="100" w:afterAutospacing="1" w:line="240" w:lineRule="auto"/>
+      <w:outlineLvl w:val="1"/>
+    </w:pPr>
+    <w:rPr>
+      <w:rFonts w:ascii="Times New Roman" w:eastAsia="Times New Roman" w:hAnsi="Times New Roman" w:cs="Times New Roman"/>
+      <w:b/>
+      <w:bCs/>
+      <w:sz w:val="36"/>
+      <w:szCs w:val="36"/>
+    </w:rPr>
+  </w:style>
   <w:style w:type="character" w:default="1" w:styleId="DefaultParagraphFont">
     <w:name w:val="Default Paragraph Font"/>
     <w:uiPriority w:val="1"/>
@@ -617,6 +1911,25 @@
     <w:uiPriority w:val="99"/>
     <w:semiHidden/>
     <w:unhideWhenUsed/>
+  </w:style>
+  <w:style w:type="character" w:customStyle="1" w:styleId="Heading2Char">
+    <w:name w:val="Heading 2 Char"/>
+    <w:basedOn w:val="DefaultParagraphFont"/>
+    <w:link w:val="Heading2"/>
+    <w:uiPriority w:val="9"/>
+    <w:rsid w:val="00266B96"/>
+    <w:rPr>
+      <w:rFonts w:ascii="Times New Roman" w:eastAsia="Times New Roman" w:hAnsi="Times New Roman" w:cs="Times New Roman"/>
+      <w:b/>
+      <w:bCs/>
+      <w:sz w:val="36"/>
+      <w:szCs w:val="36"/>
+    </w:rPr>
+  </w:style>
+  <w:style w:type="character" w:customStyle="1" w:styleId="qwen-markdown-text">
+    <w:name w:val="qwen-markdown-text"/>
+    <w:basedOn w:val="DefaultParagraphFont"/>
+    <w:rsid w:val="00266B96"/>
   </w:style>
 </w:styles>
 </file>

</xml_diff>

<commit_message>
add modbus modbus rtu mqtt cuput tag
</commit_message>
<xml_diff>
--- a/notes.docx
+++ b/notes.docx
@@ -1456,6 +1456,23 @@
     <w:p>
       <w:pPr>
         <w:rPr>
+          <w:rtl/>
+          <w:lang w:bidi="fa-IR"/>
+        </w:rPr>
+      </w:pPr>
+    </w:p>
+    <w:p>
+      <w:pPr>
+        <w:rPr>
+          <w:rtl/>
+          <w:lang w:bidi="fa-IR"/>
+        </w:rPr>
+      </w:pPr>
+    </w:p>
+    <w:p>
+      <w:pPr>
+        <w:rPr>
+          <w:rtl/>
           <w:lang w:bidi="fa-IR"/>
         </w:rPr>
       </w:pPr>
@@ -1464,10 +1481,10 @@
           <w:lang w:bidi="fa-IR"/>
         </w:rPr>
         <w:drawing>
-          <wp:inline distT="0" distB="0" distL="0" distR="0" wp14:anchorId="19BD88C8" wp14:editId="4E554BB1">
-            <wp:extent cx="5943600" cy="4515485"/>
+          <wp:inline distT="0" distB="0" distL="0" distR="0" wp14:anchorId="348F5880" wp14:editId="0514F523">
+            <wp:extent cx="5943600" cy="2198370"/>
             <wp:effectExtent l="0" t="0" r="0" b="0"/>
-            <wp:docPr id="2" name="Picture 2"/>
+            <wp:docPr id="3" name="Picture 3"/>
             <wp:cNvGraphicFramePr>
               <a:graphicFrameLocks xmlns:a="http://schemas.openxmlformats.org/drawingml/2006/main" noChangeAspect="1"/>
             </wp:cNvGraphicFramePr>
@@ -1487,6 +1504,372 @@
                   <pic:spPr>
                     <a:xfrm>
                       <a:off x="0" y="0"/>
+                      <a:ext cx="5943600" cy="2198370"/>
+                    </a:xfrm>
+                    <a:prstGeom prst="rect">
+                      <a:avLst/>
+                    </a:prstGeom>
+                  </pic:spPr>
+                </pic:pic>
+              </a:graphicData>
+            </a:graphic>
+          </wp:inline>
+        </w:drawing>
+      </w:r>
+    </w:p>
+    <w:p>
+      <w:pPr>
+        <w:rPr>
+          <w:rtl/>
+          <w:lang w:bidi="fa-IR"/>
+        </w:rPr>
+      </w:pPr>
+    </w:p>
+    <w:p>
+      <w:pPr>
+        <w:rPr>
+          <w:rtl/>
+          <w:lang w:bidi="fa-IR"/>
+        </w:rPr>
+      </w:pPr>
+      <w:r>
+        <w:rPr>
+          <w:lang w:bidi="fa-IR"/>
+        </w:rPr>
+        <w:drawing>
+          <wp:inline distT="0" distB="0" distL="0" distR="0" wp14:anchorId="62149158" wp14:editId="58A6A288">
+            <wp:extent cx="5943600" cy="2024380"/>
+            <wp:effectExtent l="0" t="0" r="0" b="0"/>
+            <wp:docPr id="4" name="Picture 4"/>
+            <wp:cNvGraphicFramePr>
+              <a:graphicFrameLocks xmlns:a="http://schemas.openxmlformats.org/drawingml/2006/main" noChangeAspect="1"/>
+            </wp:cNvGraphicFramePr>
+            <a:graphic xmlns:a="http://schemas.openxmlformats.org/drawingml/2006/main">
+              <a:graphicData uri="http://schemas.openxmlformats.org/drawingml/2006/picture">
+                <pic:pic xmlns:pic="http://schemas.openxmlformats.org/drawingml/2006/picture">
+                  <pic:nvPicPr>
+                    <pic:cNvPr id="1" name=""/>
+                    <pic:cNvPicPr/>
+                  </pic:nvPicPr>
+                  <pic:blipFill>
+                    <a:blip r:embed="rId6"/>
+                    <a:stretch>
+                      <a:fillRect/>
+                    </a:stretch>
+                  </pic:blipFill>
+                  <pic:spPr>
+                    <a:xfrm>
+                      <a:off x="0" y="0"/>
+                      <a:ext cx="5943600" cy="2024380"/>
+                    </a:xfrm>
+                    <a:prstGeom prst="rect">
+                      <a:avLst/>
+                    </a:prstGeom>
+                  </pic:spPr>
+                </pic:pic>
+              </a:graphicData>
+            </a:graphic>
+          </wp:inline>
+        </w:drawing>
+      </w:r>
+    </w:p>
+    <w:p>
+      <w:pPr>
+        <w:rPr>
+          <w:rtl/>
+          <w:lang w:bidi="fa-IR"/>
+        </w:rPr>
+      </w:pPr>
+      <w:r>
+        <w:rPr>
+          <w:lang w:bidi="fa-IR"/>
+        </w:rPr>
+        <w:lastRenderedPageBreak/>
+        <w:drawing>
+          <wp:inline distT="0" distB="0" distL="0" distR="0" wp14:anchorId="0961CC0C" wp14:editId="4FE859A8">
+            <wp:extent cx="5943600" cy="1764030"/>
+            <wp:effectExtent l="0" t="0" r="0" b="7620"/>
+            <wp:docPr id="5" name="Picture 5"/>
+            <wp:cNvGraphicFramePr>
+              <a:graphicFrameLocks xmlns:a="http://schemas.openxmlformats.org/drawingml/2006/main" noChangeAspect="1"/>
+            </wp:cNvGraphicFramePr>
+            <a:graphic xmlns:a="http://schemas.openxmlformats.org/drawingml/2006/main">
+              <a:graphicData uri="http://schemas.openxmlformats.org/drawingml/2006/picture">
+                <pic:pic xmlns:pic="http://schemas.openxmlformats.org/drawingml/2006/picture">
+                  <pic:nvPicPr>
+                    <pic:cNvPr id="1" name=""/>
+                    <pic:cNvPicPr/>
+                  </pic:nvPicPr>
+                  <pic:blipFill>
+                    <a:blip r:embed="rId7"/>
+                    <a:stretch>
+                      <a:fillRect/>
+                    </a:stretch>
+                  </pic:blipFill>
+                  <pic:spPr>
+                    <a:xfrm>
+                      <a:off x="0" y="0"/>
+                      <a:ext cx="5943600" cy="1764030"/>
+                    </a:xfrm>
+                    <a:prstGeom prst="rect">
+                      <a:avLst/>
+                    </a:prstGeom>
+                  </pic:spPr>
+                </pic:pic>
+              </a:graphicData>
+            </a:graphic>
+          </wp:inline>
+        </w:drawing>
+      </w:r>
+    </w:p>
+    <w:p>
+      <w:pPr>
+        <w:rPr>
+          <w:rtl/>
+          <w:lang w:bidi="fa-IR"/>
+        </w:rPr>
+      </w:pPr>
+      <w:r>
+        <w:rPr>
+          <w:lang w:bidi="fa-IR"/>
+        </w:rPr>
+        <w:drawing>
+          <wp:inline distT="0" distB="0" distL="0" distR="0" wp14:anchorId="0834E0C8" wp14:editId="1B67485C">
+            <wp:extent cx="5943600" cy="2141220"/>
+            <wp:effectExtent l="0" t="0" r="0" b="0"/>
+            <wp:docPr id="6" name="Picture 6"/>
+            <wp:cNvGraphicFramePr>
+              <a:graphicFrameLocks xmlns:a="http://schemas.openxmlformats.org/drawingml/2006/main" noChangeAspect="1"/>
+            </wp:cNvGraphicFramePr>
+            <a:graphic xmlns:a="http://schemas.openxmlformats.org/drawingml/2006/main">
+              <a:graphicData uri="http://schemas.openxmlformats.org/drawingml/2006/picture">
+                <pic:pic xmlns:pic="http://schemas.openxmlformats.org/drawingml/2006/picture">
+                  <pic:nvPicPr>
+                    <pic:cNvPr id="1" name=""/>
+                    <pic:cNvPicPr/>
+                  </pic:nvPicPr>
+                  <pic:blipFill>
+                    <a:blip r:embed="rId8"/>
+                    <a:stretch>
+                      <a:fillRect/>
+                    </a:stretch>
+                  </pic:blipFill>
+                  <pic:spPr>
+                    <a:xfrm>
+                      <a:off x="0" y="0"/>
+                      <a:ext cx="5943600" cy="2141220"/>
+                    </a:xfrm>
+                    <a:prstGeom prst="rect">
+                      <a:avLst/>
+                    </a:prstGeom>
+                  </pic:spPr>
+                </pic:pic>
+              </a:graphicData>
+            </a:graphic>
+          </wp:inline>
+        </w:drawing>
+      </w:r>
+    </w:p>
+    <w:p>
+      <w:pPr>
+        <w:rPr>
+          <w:rtl/>
+          <w:lang w:bidi="fa-IR"/>
+        </w:rPr>
+      </w:pPr>
+      <w:r>
+        <w:rPr>
+          <w:lang w:bidi="fa-IR"/>
+        </w:rPr>
+        <w:drawing>
+          <wp:inline distT="0" distB="0" distL="0" distR="0" wp14:anchorId="742AE009" wp14:editId="0376DF7E">
+            <wp:extent cx="5943600" cy="1736090"/>
+            <wp:effectExtent l="0" t="0" r="0" b="0"/>
+            <wp:docPr id="7" name="Picture 7"/>
+            <wp:cNvGraphicFramePr>
+              <a:graphicFrameLocks xmlns:a="http://schemas.openxmlformats.org/drawingml/2006/main" noChangeAspect="1"/>
+            </wp:cNvGraphicFramePr>
+            <a:graphic xmlns:a="http://schemas.openxmlformats.org/drawingml/2006/main">
+              <a:graphicData uri="http://schemas.openxmlformats.org/drawingml/2006/picture">
+                <pic:pic xmlns:pic="http://schemas.openxmlformats.org/drawingml/2006/picture">
+                  <pic:nvPicPr>
+                    <pic:cNvPr id="1" name=""/>
+                    <pic:cNvPicPr/>
+                  </pic:nvPicPr>
+                  <pic:blipFill>
+                    <a:blip r:embed="rId9"/>
+                    <a:stretch>
+                      <a:fillRect/>
+                    </a:stretch>
+                  </pic:blipFill>
+                  <pic:spPr>
+                    <a:xfrm>
+                      <a:off x="0" y="0"/>
+                      <a:ext cx="5943600" cy="1736090"/>
+                    </a:xfrm>
+                    <a:prstGeom prst="rect">
+                      <a:avLst/>
+                    </a:prstGeom>
+                  </pic:spPr>
+                </pic:pic>
+              </a:graphicData>
+            </a:graphic>
+          </wp:inline>
+        </w:drawing>
+      </w:r>
+    </w:p>
+    <w:p>
+      <w:pPr>
+        <w:rPr>
+          <w:rtl/>
+          <w:lang w:bidi="fa-IR"/>
+        </w:rPr>
+      </w:pPr>
+    </w:p>
+    <w:p>
+      <w:pPr>
+        <w:rPr>
+          <w:rtl/>
+          <w:lang w:bidi="fa-IR"/>
+        </w:rPr>
+      </w:pPr>
+      <w:r>
+        <w:rPr>
+          <w:lang w:bidi="fa-IR"/>
+        </w:rPr>
+        <w:lastRenderedPageBreak/>
+        <w:drawing>
+          <wp:inline distT="0" distB="0" distL="0" distR="0" wp14:anchorId="3BBDD521" wp14:editId="4EC1C137">
+            <wp:extent cx="5943600" cy="4084955"/>
+            <wp:effectExtent l="0" t="0" r="0" b="0"/>
+            <wp:docPr id="8" name="Picture 8"/>
+            <wp:cNvGraphicFramePr>
+              <a:graphicFrameLocks xmlns:a="http://schemas.openxmlformats.org/drawingml/2006/main" noChangeAspect="1"/>
+            </wp:cNvGraphicFramePr>
+            <a:graphic xmlns:a="http://schemas.openxmlformats.org/drawingml/2006/main">
+              <a:graphicData uri="http://schemas.openxmlformats.org/drawingml/2006/picture">
+                <pic:pic xmlns:pic="http://schemas.openxmlformats.org/drawingml/2006/picture">
+                  <pic:nvPicPr>
+                    <pic:cNvPr id="1" name=""/>
+                    <pic:cNvPicPr/>
+                  </pic:nvPicPr>
+                  <pic:blipFill>
+                    <a:blip r:embed="rId10"/>
+                    <a:stretch>
+                      <a:fillRect/>
+                    </a:stretch>
+                  </pic:blipFill>
+                  <pic:spPr>
+                    <a:xfrm>
+                      <a:off x="0" y="0"/>
+                      <a:ext cx="5943600" cy="4084955"/>
+                    </a:xfrm>
+                    <a:prstGeom prst="rect">
+                      <a:avLst/>
+                    </a:prstGeom>
+                  </pic:spPr>
+                </pic:pic>
+              </a:graphicData>
+            </a:graphic>
+          </wp:inline>
+        </w:drawing>
+      </w:r>
+    </w:p>
+    <w:p>
+      <w:pPr>
+        <w:rPr>
+          <w:rtl/>
+          <w:lang w:bidi="fa-IR"/>
+        </w:rPr>
+      </w:pPr>
+    </w:p>
+    <w:p>
+      <w:pPr>
+        <w:rPr>
+          <w:rtl/>
+          <w:lang w:bidi="fa-IR"/>
+        </w:rPr>
+      </w:pPr>
+      <w:r>
+        <w:rPr>
+          <w:lang w:bidi="fa-IR"/>
+        </w:rPr>
+        <w:lastRenderedPageBreak/>
+        <w:drawing>
+          <wp:inline distT="0" distB="0" distL="0" distR="0" wp14:anchorId="4F1BE725" wp14:editId="677C69BF">
+            <wp:extent cx="5943600" cy="1984375"/>
+            <wp:effectExtent l="0" t="0" r="0" b="0"/>
+            <wp:docPr id="9" name="Picture 9"/>
+            <wp:cNvGraphicFramePr>
+              <a:graphicFrameLocks xmlns:a="http://schemas.openxmlformats.org/drawingml/2006/main" noChangeAspect="1"/>
+            </wp:cNvGraphicFramePr>
+            <a:graphic xmlns:a="http://schemas.openxmlformats.org/drawingml/2006/main">
+              <a:graphicData uri="http://schemas.openxmlformats.org/drawingml/2006/picture">
+                <pic:pic xmlns:pic="http://schemas.openxmlformats.org/drawingml/2006/picture">
+                  <pic:nvPicPr>
+                    <pic:cNvPr id="1" name=""/>
+                    <pic:cNvPicPr/>
+                  </pic:nvPicPr>
+                  <pic:blipFill>
+                    <a:blip r:embed="rId11"/>
+                    <a:stretch>
+                      <a:fillRect/>
+                    </a:stretch>
+                  </pic:blipFill>
+                  <pic:spPr>
+                    <a:xfrm>
+                      <a:off x="0" y="0"/>
+                      <a:ext cx="5943600" cy="1984375"/>
+                    </a:xfrm>
+                    <a:prstGeom prst="rect">
+                      <a:avLst/>
+                    </a:prstGeom>
+                  </pic:spPr>
+                </pic:pic>
+              </a:graphicData>
+            </a:graphic>
+          </wp:inline>
+        </w:drawing>
+      </w:r>
+    </w:p>
+    <w:p>
+      <w:pPr>
+        <w:rPr>
+          <w:rFonts w:hint="cs"/>
+          <w:rtl/>
+          <w:lang w:bidi="fa-IR"/>
+        </w:rPr>
+      </w:pPr>
+      <w:bookmarkStart w:id="0" w:name="_GoBack"/>
+      <w:bookmarkEnd w:id="0"/>
+      <w:r>
+        <w:rPr>
+          <w:lang w:bidi="fa-IR"/>
+        </w:rPr>
+        <w:drawing>
+          <wp:inline distT="0" distB="0" distL="0" distR="0" wp14:anchorId="19BD88C8" wp14:editId="4E554BB1">
+            <wp:extent cx="5943600" cy="4515485"/>
+            <wp:effectExtent l="0" t="0" r="0" b="0"/>
+            <wp:docPr id="2" name="Picture 2"/>
+            <wp:cNvGraphicFramePr>
+              <a:graphicFrameLocks xmlns:a="http://schemas.openxmlformats.org/drawingml/2006/main" noChangeAspect="1"/>
+            </wp:cNvGraphicFramePr>
+            <a:graphic xmlns:a="http://schemas.openxmlformats.org/drawingml/2006/main">
+              <a:graphicData uri="http://schemas.openxmlformats.org/drawingml/2006/picture">
+                <pic:pic xmlns:pic="http://schemas.openxmlformats.org/drawingml/2006/picture">
+                  <pic:nvPicPr>
+                    <pic:cNvPr id="1" name=""/>
+                    <pic:cNvPicPr/>
+                  </pic:nvPicPr>
+                  <pic:blipFill>
+                    <a:blip r:embed="rId12"/>
+                    <a:stretch>
+                      <a:fillRect/>
+                    </a:stretch>
+                  </pic:blipFill>
+                  <pic:spPr>
+                    <a:xfrm>
+                      <a:off x="0" y="0"/>
                       <a:ext cx="5943600" cy="4515485"/>
                     </a:xfrm>
                     <a:prstGeom prst="rect">
@@ -1499,8 +1882,6 @@
           </wp:inline>
         </w:drawing>
       </w:r>
-      <w:bookmarkStart w:id="0" w:name="_GoBack"/>
-      <w:bookmarkEnd w:id="0"/>
     </w:p>
     <w:sectPr>
       <w:pgSz w:w="12240" w:h="15840"/>

</xml_diff>

<commit_message>
add mqtt fix tested. add downsampling.
</commit_message>
<xml_diff>
--- a/notes.docx
+++ b/notes.docx
@@ -1478,7 +1478,7 @@
       </w:pPr>
       <w:r>
         <w:rPr>
-          <w:lang w:bidi="fa-IR"/>
+          <w:noProof/>
         </w:rPr>
         <w:drawing>
           <wp:inline distT="0" distB="0" distL="0" distR="0" wp14:anchorId="348F5880" wp14:editId="0514F523">
@@ -1534,7 +1534,7 @@
       </w:pPr>
       <w:r>
         <w:rPr>
-          <w:lang w:bidi="fa-IR"/>
+          <w:noProof/>
         </w:rPr>
         <w:drawing>
           <wp:inline distT="0" distB="0" distL="0" distR="0" wp14:anchorId="62149158" wp14:editId="58A6A288">
@@ -1582,7 +1582,7 @@
       </w:pPr>
       <w:r>
         <w:rPr>
-          <w:lang w:bidi="fa-IR"/>
+          <w:noProof/>
         </w:rPr>
         <w:lastRenderedPageBreak/>
         <w:drawing>
@@ -1631,7 +1631,7 @@
       </w:pPr>
       <w:r>
         <w:rPr>
-          <w:lang w:bidi="fa-IR"/>
+          <w:noProof/>
         </w:rPr>
         <w:drawing>
           <wp:inline distT="0" distB="0" distL="0" distR="0" wp14:anchorId="0834E0C8" wp14:editId="1B67485C">
@@ -1679,7 +1679,7 @@
       </w:pPr>
       <w:r>
         <w:rPr>
-          <w:lang w:bidi="fa-IR"/>
+          <w:noProof/>
         </w:rPr>
         <w:drawing>
           <wp:inline distT="0" distB="0" distL="0" distR="0" wp14:anchorId="742AE009" wp14:editId="0376DF7E">
@@ -1735,7 +1735,7 @@
       </w:pPr>
       <w:r>
         <w:rPr>
-          <w:lang w:bidi="fa-IR"/>
+          <w:noProof/>
         </w:rPr>
         <w:lastRenderedPageBreak/>
         <w:drawing>
@@ -1792,9 +1792,8 @@
       </w:pPr>
       <w:r>
         <w:rPr>
-          <w:lang w:bidi="fa-IR"/>
-        </w:rPr>
-        <w:lastRenderedPageBreak/>
+          <w:noProof/>
+        </w:rPr>
         <w:drawing>
           <wp:inline distT="0" distB="0" distL="0" distR="0" wp14:anchorId="4F1BE725" wp14:editId="677C69BF">
             <wp:extent cx="5943600" cy="1984375"/>
@@ -1835,17 +1834,14 @@
     <w:p>
       <w:pPr>
         <w:rPr>
-          <w:rFonts w:hint="cs"/>
-          <w:rtl/>
-          <w:lang w:bidi="fa-IR"/>
-        </w:rPr>
-      </w:pPr>
-      <w:bookmarkStart w:id="0" w:name="_GoBack"/>
-      <w:bookmarkEnd w:id="0"/>
-      <w:r>
-        <w:rPr>
-          <w:lang w:bidi="fa-IR"/>
-        </w:rPr>
+          <w:lang w:bidi="fa-IR"/>
+        </w:rPr>
+      </w:pPr>
+      <w:r>
+        <w:rPr>
+          <w:noProof/>
+        </w:rPr>
+        <w:lastRenderedPageBreak/>
         <w:drawing>
           <wp:inline distT="0" distB="0" distL="0" distR="0" wp14:anchorId="19BD88C8" wp14:editId="4E554BB1">
             <wp:extent cx="5943600" cy="4515485"/>
@@ -1871,6 +1867,2189 @@
                     <a:xfrm>
                       <a:off x="0" y="0"/>
                       <a:ext cx="5943600" cy="4515485"/>
+                    </a:xfrm>
+                    <a:prstGeom prst="rect">
+                      <a:avLst/>
+                    </a:prstGeom>
+                  </pic:spPr>
+                </pic:pic>
+              </a:graphicData>
+            </a:graphic>
+          </wp:inline>
+        </w:drawing>
+      </w:r>
+    </w:p>
+    <w:p>
+      <w:pPr>
+        <w:rPr>
+          <w:lang w:bidi="fa-IR"/>
+        </w:rPr>
+      </w:pPr>
+      <w:r>
+        <w:rPr>
+          <w:lang w:bidi="fa-IR"/>
+        </w:rPr>
+        <w:lastRenderedPageBreak/>
+        <w:drawing>
+          <wp:inline distT="0" distB="0" distL="0" distR="0" wp14:anchorId="30AE2A56" wp14:editId="378E4DE8">
+            <wp:extent cx="5943600" cy="3787775"/>
+            <wp:effectExtent l="0" t="0" r="0" b="3175"/>
+            <wp:docPr id="10" name="Picture 10"/>
+            <wp:cNvGraphicFramePr>
+              <a:graphicFrameLocks xmlns:a="http://schemas.openxmlformats.org/drawingml/2006/main" noChangeAspect="1"/>
+            </wp:cNvGraphicFramePr>
+            <a:graphic xmlns:a="http://schemas.openxmlformats.org/drawingml/2006/main">
+              <a:graphicData uri="http://schemas.openxmlformats.org/drawingml/2006/picture">
+                <pic:pic xmlns:pic="http://schemas.openxmlformats.org/drawingml/2006/picture">
+                  <pic:nvPicPr>
+                    <pic:cNvPr id="1" name=""/>
+                    <pic:cNvPicPr/>
+                  </pic:nvPicPr>
+                  <pic:blipFill>
+                    <a:blip r:embed="rId13"/>
+                    <a:stretch>
+                      <a:fillRect/>
+                    </a:stretch>
+                  </pic:blipFill>
+                  <pic:spPr>
+                    <a:xfrm>
+                      <a:off x="0" y="0"/>
+                      <a:ext cx="5943600" cy="3787775"/>
+                    </a:xfrm>
+                    <a:prstGeom prst="rect">
+                      <a:avLst/>
+                    </a:prstGeom>
+                  </pic:spPr>
+                </pic:pic>
+              </a:graphicData>
+            </a:graphic>
+          </wp:inline>
+        </w:drawing>
+      </w:r>
+    </w:p>
+    <w:p>
+      <w:pPr>
+        <w:rPr>
+          <w:lang w:bidi="fa-IR"/>
+        </w:rPr>
+      </w:pPr>
+    </w:p>
+    <w:p>
+      <w:pPr>
+        <w:rPr>
+          <w:lang w:bidi="fa-IR"/>
+        </w:rPr>
+      </w:pPr>
+    </w:p>
+    <w:p>
+      <w:pPr>
+        <w:rPr>
+          <w:lang w:bidi="fa-IR"/>
+        </w:rPr>
+      </w:pPr>
+      <w:r>
+        <w:rPr>
+          <w:lang w:bidi="fa-IR"/>
+        </w:rPr>
+        <w:t xml:space="preserve">SELECT time, </w:t>
+      </w:r>
+      <w:proofErr w:type="spellStart"/>
+      <w:r>
+        <w:rPr>
+          <w:lang w:bidi="fa-IR"/>
+        </w:rPr>
+        <w:t>tag_id</w:t>
+      </w:r>
+      <w:proofErr w:type="spellEnd"/>
+      <w:r>
+        <w:rPr>
+          <w:lang w:bidi="fa-IR"/>
+        </w:rPr>
+        <w:t xml:space="preserve">, </w:t>
+      </w:r>
+      <w:proofErr w:type="spellStart"/>
+      <w:r>
+        <w:rPr>
+          <w:lang w:bidi="fa-IR"/>
+        </w:rPr>
+        <w:t>raw_value</w:t>
+      </w:r>
+      <w:proofErr w:type="spellEnd"/>
+      <w:r>
+        <w:rPr>
+          <w:lang w:bidi="fa-IR"/>
+        </w:rPr>
+        <w:t xml:space="preserve">, </w:t>
+      </w:r>
+      <w:proofErr w:type="spellStart"/>
+      <w:r>
+        <w:rPr>
+          <w:lang w:bidi="fa-IR"/>
+        </w:rPr>
+        <w:t>eng_value</w:t>
+      </w:r>
+      <w:proofErr w:type="spellEnd"/>
+      <w:r>
+        <w:rPr>
+          <w:lang w:bidi="fa-IR"/>
+        </w:rPr>
+        <w:t>, quality</w:t>
+      </w:r>
+    </w:p>
+    <w:p>
+      <w:pPr>
+        <w:rPr>
+          <w:lang w:bidi="fa-IR"/>
+        </w:rPr>
+      </w:pPr>
+      <w:r>
+        <w:rPr>
+          <w:lang w:bidi="fa-IR"/>
+        </w:rPr>
+        <w:t xml:space="preserve">FROM </w:t>
+      </w:r>
+      <w:proofErr w:type="spellStart"/>
+      <w:r>
+        <w:rPr>
+          <w:lang w:bidi="fa-IR"/>
+        </w:rPr>
+        <w:t>tag_values_raw</w:t>
+      </w:r>
+      <w:proofErr w:type="spellEnd"/>
+    </w:p>
+    <w:p>
+      <w:pPr>
+        <w:rPr>
+          <w:lang w:bidi="fa-IR"/>
+        </w:rPr>
+      </w:pPr>
+      <w:r>
+        <w:rPr>
+          <w:lang w:bidi="fa-IR"/>
+        </w:rPr>
+        <w:t xml:space="preserve">WHERE </w:t>
+      </w:r>
+      <w:proofErr w:type="spellStart"/>
+      <w:r>
+        <w:rPr>
+          <w:lang w:bidi="fa-IR"/>
+        </w:rPr>
+        <w:t>tag_id</w:t>
+      </w:r>
+      <w:proofErr w:type="spellEnd"/>
+      <w:r>
+        <w:rPr>
+          <w:lang w:bidi="fa-IR"/>
+        </w:rPr>
+        <w:t xml:space="preserve"> = 2001</w:t>
+      </w:r>
+    </w:p>
+    <w:p>
+      <w:pPr>
+        <w:rPr>
+          <w:lang w:bidi="fa-IR"/>
+        </w:rPr>
+      </w:pPr>
+      <w:r>
+        <w:rPr>
+          <w:lang w:bidi="fa-IR"/>
+        </w:rPr>
+        <w:t>ORDER BY time DESC</w:t>
+      </w:r>
+    </w:p>
+    <w:p>
+      <w:pPr>
+        <w:rPr>
+          <w:lang w:bidi="fa-IR"/>
+        </w:rPr>
+      </w:pPr>
+      <w:r>
+        <w:rPr>
+          <w:lang w:bidi="fa-IR"/>
+        </w:rPr>
+        <w:t>LIMIT 10;</w:t>
+      </w:r>
+    </w:p>
+    <w:p>
+      <w:pPr>
+        <w:rPr>
+          <w:lang w:bidi="fa-IR"/>
+        </w:rPr>
+      </w:pPr>
+    </w:p>
+    <w:p>
+      <w:pPr>
+        <w:rPr>
+          <w:lang w:bidi="fa-IR"/>
+        </w:rPr>
+      </w:pPr>
+    </w:p>
+    <w:p>
+      <w:pPr>
+        <w:rPr>
+          <w:lang w:bidi="fa-IR"/>
+        </w:rPr>
+      </w:pPr>
+    </w:p>
+    <w:p>
+      <w:pPr>
+        <w:rPr>
+          <w:lang w:bidi="fa-IR"/>
+        </w:rPr>
+      </w:pPr>
+      <w:r>
+        <w:rPr>
+          <w:lang w:bidi="fa-IR"/>
+        </w:rPr>
+        <w:lastRenderedPageBreak/>
+        <w:drawing>
+          <wp:inline distT="0" distB="0" distL="0" distR="0" wp14:anchorId="7C53F685" wp14:editId="6EB115E5">
+            <wp:extent cx="5943600" cy="2570480"/>
+            <wp:effectExtent l="0" t="0" r="0" b="1270"/>
+            <wp:docPr id="11" name="Picture 11"/>
+            <wp:cNvGraphicFramePr>
+              <a:graphicFrameLocks xmlns:a="http://schemas.openxmlformats.org/drawingml/2006/main" noChangeAspect="1"/>
+            </wp:cNvGraphicFramePr>
+            <a:graphic xmlns:a="http://schemas.openxmlformats.org/drawingml/2006/main">
+              <a:graphicData uri="http://schemas.openxmlformats.org/drawingml/2006/picture">
+                <pic:pic xmlns:pic="http://schemas.openxmlformats.org/drawingml/2006/picture">
+                  <pic:nvPicPr>
+                    <pic:cNvPr id="1" name=""/>
+                    <pic:cNvPicPr/>
+                  </pic:nvPicPr>
+                  <pic:blipFill>
+                    <a:blip r:embed="rId14"/>
+                    <a:stretch>
+                      <a:fillRect/>
+                    </a:stretch>
+                  </pic:blipFill>
+                  <pic:spPr>
+                    <a:xfrm>
+                      <a:off x="0" y="0"/>
+                      <a:ext cx="5943600" cy="2570480"/>
+                    </a:xfrm>
+                    <a:prstGeom prst="rect">
+                      <a:avLst/>
+                    </a:prstGeom>
+                  </pic:spPr>
+                </pic:pic>
+              </a:graphicData>
+            </a:graphic>
+          </wp:inline>
+        </w:drawing>
+      </w:r>
+    </w:p>
+    <w:p>
+      <w:pPr>
+        <w:rPr>
+          <w:lang w:bidi="fa-IR"/>
+        </w:rPr>
+      </w:pPr>
+    </w:p>
+    <w:p>
+      <w:pPr>
+        <w:pStyle w:val="Heading1"/>
+        <w:pBdr>
+          <w:top w:val="single" w:sz="2" w:space="0" w:color="E3E3E3"/>
+          <w:left w:val="single" w:sz="2" w:space="0" w:color="E3E3E3"/>
+          <w:bottom w:val="single" w:sz="2" w:space="0" w:color="E3E3E3"/>
+          <w:right w:val="single" w:sz="2" w:space="0" w:color="E3E3E3"/>
+        </w:pBdr>
+        <w:shd w:val="clear" w:color="auto" w:fill="FFFFFF"/>
+        <w:bidi/>
+        <w:spacing w:before="0"/>
+        <w:rPr>
+          <w:rFonts w:ascii="Arial" w:hAnsi="Arial" w:cs="Arial"/>
+          <w:color w:val="1D1D1F"/>
+        </w:rPr>
+      </w:pPr>
+      <w:r>
+        <w:rPr>
+          <w:rStyle w:val="qwen-markdown-text"/>
+          <w:rFonts w:ascii="Arial" w:hAnsi="Arial" w:cs="Arial"/>
+          <w:color w:val="1D1D1F"/>
+          <w:bdr w:val="single" w:sz="2" w:space="0" w:color="E3E3E3" w:frame="1"/>
+          <w:rtl/>
+        </w:rPr>
+        <w:t xml:space="preserve">بررسی </w:t>
+      </w:r>
+      <w:r>
+        <w:rPr>
+          <w:rStyle w:val="qwen-markdown-text"/>
+          <w:rFonts w:ascii="Arial" w:hAnsi="Arial" w:cs="Arial"/>
+          <w:color w:val="1D1D1F"/>
+          <w:bdr w:val="single" w:sz="2" w:space="0" w:color="E3E3E3" w:frame="1"/>
+        </w:rPr>
+        <w:t>Continuous Aggregate Views</w:t>
+      </w:r>
+    </w:p>
+    <w:p>
+      <w:pPr>
+        <w:rPr>
+          <w:lang w:bidi="fa-IR"/>
+        </w:rPr>
+      </w:pPr>
+    </w:p>
+    <w:p>
+      <w:pPr>
+        <w:rPr>
+          <w:lang w:bidi="fa-IR"/>
+        </w:rPr>
+      </w:pPr>
+      <w:r>
+        <w:rPr>
+          <w:lang w:bidi="fa-IR"/>
+        </w:rPr>
+        <w:t xml:space="preserve">SELECT </w:t>
+      </w:r>
+      <w:proofErr w:type="spellStart"/>
+      <w:r>
+        <w:rPr>
+          <w:lang w:bidi="fa-IR"/>
+        </w:rPr>
+        <w:t>view_name</w:t>
+      </w:r>
+      <w:proofErr w:type="spellEnd"/>
+      <w:r>
+        <w:rPr>
+          <w:lang w:bidi="fa-IR"/>
+        </w:rPr>
+        <w:t xml:space="preserve">, </w:t>
+      </w:r>
+      <w:proofErr w:type="spellStart"/>
+      <w:r>
+        <w:rPr>
+          <w:lang w:bidi="fa-IR"/>
+        </w:rPr>
+        <w:t>materialization_hypertable_name</w:t>
+      </w:r>
+      <w:proofErr w:type="spellEnd"/>
+    </w:p>
+    <w:p>
+      <w:pPr>
+        <w:rPr>
+          <w:lang w:bidi="fa-IR"/>
+        </w:rPr>
+      </w:pPr>
+      <w:r>
+        <w:rPr>
+          <w:lang w:bidi="fa-IR"/>
+        </w:rPr>
+        <w:t xml:space="preserve">FROM </w:t>
+      </w:r>
+      <w:proofErr w:type="spellStart"/>
+      <w:r>
+        <w:rPr>
+          <w:lang w:bidi="fa-IR"/>
+        </w:rPr>
+        <w:t>timescaledb_</w:t>
+      </w:r>
+      <w:proofErr w:type="gramStart"/>
+      <w:r>
+        <w:rPr>
+          <w:lang w:bidi="fa-IR"/>
+        </w:rPr>
+        <w:t>information.continuous</w:t>
+      </w:r>
+      <w:proofErr w:type="gramEnd"/>
+      <w:r>
+        <w:rPr>
+          <w:lang w:bidi="fa-IR"/>
+        </w:rPr>
+        <w:t>_aggregates</w:t>
+      </w:r>
+      <w:proofErr w:type="spellEnd"/>
+      <w:r>
+        <w:rPr>
+          <w:lang w:bidi="fa-IR"/>
+        </w:rPr>
+        <w:t>;</w:t>
+      </w:r>
+    </w:p>
+    <w:p>
+      <w:pPr>
+        <w:rPr>
+          <w:lang w:bidi="fa-IR"/>
+        </w:rPr>
+      </w:pPr>
+    </w:p>
+    <w:p>
+      <w:pPr>
+        <w:pStyle w:val="Heading1"/>
+        <w:pBdr>
+          <w:top w:val="single" w:sz="2" w:space="0" w:color="E3E3E3"/>
+          <w:left w:val="single" w:sz="2" w:space="0" w:color="E3E3E3"/>
+          <w:bottom w:val="single" w:sz="2" w:space="0" w:color="E3E3E3"/>
+          <w:right w:val="single" w:sz="2" w:space="0" w:color="E3E3E3"/>
+        </w:pBdr>
+        <w:shd w:val="clear" w:color="auto" w:fill="FFFFFF"/>
+        <w:bidi/>
+        <w:spacing w:before="0"/>
+        <w:rPr>
+          <w:rFonts w:ascii="Arial" w:hAnsi="Arial" w:cs="Arial"/>
+          <w:color w:val="1D1D1F"/>
+        </w:rPr>
+      </w:pPr>
+      <w:r>
+        <w:rPr>
+          <w:rStyle w:val="qwen-markdown-text"/>
+          <w:rFonts w:ascii="Arial" w:hAnsi="Arial" w:cs="Arial"/>
+          <w:color w:val="1D1D1F"/>
+          <w:bdr w:val="single" w:sz="2" w:space="0" w:color="E3E3E3" w:frame="1"/>
+          <w:rtl/>
+        </w:rPr>
+        <w:t xml:space="preserve">12. بررسی </w:t>
+      </w:r>
+      <w:r>
+        <w:rPr>
+          <w:rStyle w:val="qwen-markdown-text"/>
+          <w:rFonts w:ascii="Arial" w:hAnsi="Arial" w:cs="Arial"/>
+          <w:color w:val="1D1D1F"/>
+          <w:bdr w:val="single" w:sz="2" w:space="0" w:color="E3E3E3" w:frame="1"/>
+        </w:rPr>
+        <w:t>Policies</w:t>
+      </w:r>
+    </w:p>
+    <w:p>
+      <w:pPr>
+        <w:rPr>
+          <w:lang w:bidi="fa-IR"/>
+        </w:rPr>
+      </w:pPr>
+    </w:p>
+    <w:p>
+      <w:pPr>
+        <w:rPr>
+          <w:lang w:bidi="fa-IR"/>
+        </w:rPr>
+      </w:pPr>
+      <w:r>
+        <w:rPr>
+          <w:lang w:bidi="fa-IR"/>
+        </w:rPr>
+        <w:t xml:space="preserve">SELECT </w:t>
+      </w:r>
+      <w:proofErr w:type="spellStart"/>
+      <w:r>
+        <w:rPr>
+          <w:lang w:bidi="fa-IR"/>
+        </w:rPr>
+        <w:t>application_name</w:t>
+      </w:r>
+      <w:proofErr w:type="spellEnd"/>
+      <w:r>
+        <w:rPr>
+          <w:lang w:bidi="fa-IR"/>
+        </w:rPr>
+        <w:t xml:space="preserve">, </w:t>
+      </w:r>
+      <w:proofErr w:type="spellStart"/>
+      <w:r>
+        <w:rPr>
+          <w:lang w:bidi="fa-IR"/>
+        </w:rPr>
+        <w:t>proc_name</w:t>
+      </w:r>
+      <w:proofErr w:type="spellEnd"/>
+      <w:r>
+        <w:rPr>
+          <w:lang w:bidi="fa-IR"/>
+        </w:rPr>
+        <w:t xml:space="preserve">, </w:t>
+      </w:r>
+      <w:proofErr w:type="spellStart"/>
+      <w:r>
+        <w:rPr>
+          <w:lang w:bidi="fa-IR"/>
+        </w:rPr>
+        <w:t>config</w:t>
+      </w:r>
+      <w:proofErr w:type="spellEnd"/>
+    </w:p>
+    <w:p>
+      <w:pPr>
+        <w:rPr>
+          <w:lang w:bidi="fa-IR"/>
+        </w:rPr>
+      </w:pPr>
+      <w:r>
+        <w:rPr>
+          <w:lang w:bidi="fa-IR"/>
+        </w:rPr>
+        <w:t>FROM timescaledb_information.jobs</w:t>
+      </w:r>
+    </w:p>
+    <w:p>
+      <w:pPr>
+        <w:rPr>
+          <w:lang w:bidi="fa-IR"/>
+        </w:rPr>
+      </w:pPr>
+      <w:r>
+        <w:rPr>
+          <w:lang w:bidi="fa-IR"/>
+        </w:rPr>
+        <w:t xml:space="preserve">ORDER BY </w:t>
+      </w:r>
+      <w:proofErr w:type="spellStart"/>
+      <w:r>
+        <w:rPr>
+          <w:lang w:bidi="fa-IR"/>
+        </w:rPr>
+        <w:t>job_id</w:t>
+      </w:r>
+      <w:proofErr w:type="spellEnd"/>
+      <w:r>
+        <w:rPr>
+          <w:lang w:bidi="fa-IR"/>
+        </w:rPr>
+        <w:t>;</w:t>
+      </w:r>
+    </w:p>
+    <w:p>
+      <w:pPr>
+        <w:rPr>
+          <w:lang w:bidi="fa-IR"/>
+        </w:rPr>
+      </w:pPr>
+    </w:p>
+    <w:p>
+      <w:pPr>
+        <w:pStyle w:val="Heading1"/>
+        <w:pBdr>
+          <w:top w:val="single" w:sz="2" w:space="0" w:color="E3E3E3"/>
+          <w:left w:val="single" w:sz="2" w:space="0" w:color="E3E3E3"/>
+          <w:bottom w:val="single" w:sz="2" w:space="0" w:color="E3E3E3"/>
+          <w:right w:val="single" w:sz="2" w:space="0" w:color="E3E3E3"/>
+        </w:pBdr>
+        <w:shd w:val="clear" w:color="auto" w:fill="FFFFFF"/>
+        <w:bidi/>
+        <w:spacing w:before="0"/>
+        <w:rPr>
+          <w:rFonts w:ascii="Arial" w:hAnsi="Arial" w:cs="Arial"/>
+          <w:color w:val="1D1D1F"/>
+        </w:rPr>
+      </w:pPr>
+      <w:r>
+        <w:rPr>
+          <w:rStyle w:val="qwen-markdown-text"/>
+          <w:rFonts w:ascii="Arial" w:hAnsi="Arial" w:cs="Arial"/>
+          <w:color w:val="1D1D1F"/>
+          <w:bdr w:val="single" w:sz="2" w:space="0" w:color="E3E3E3" w:frame="1"/>
+          <w:rtl/>
+        </w:rPr>
+        <w:t xml:space="preserve">تست </w:t>
+      </w:r>
+      <w:r>
+        <w:rPr>
+          <w:rStyle w:val="qwen-markdown-text"/>
+          <w:rFonts w:ascii="Arial" w:hAnsi="Arial" w:cs="Arial"/>
+          <w:color w:val="1D1D1F"/>
+          <w:bdr w:val="single" w:sz="2" w:space="0" w:color="E3E3E3" w:frame="1"/>
+        </w:rPr>
+        <w:t>Query</w:t>
+      </w:r>
+    </w:p>
+    <w:p>
+      <w:pPr>
+        <w:rPr>
+          <w:lang w:bidi="fa-IR"/>
+        </w:rPr>
+      </w:pPr>
+      <w:r>
+        <w:rPr>
+          <w:lang w:bidi="fa-IR"/>
+        </w:rPr>
+        <w:t xml:space="preserve">-- </w:t>
+      </w:r>
+      <w:r>
+        <w:rPr>
+          <w:rFonts w:cs="Arial"/>
+          <w:rtl/>
+          <w:lang w:bidi="fa-IR"/>
+        </w:rPr>
+        <w:t>داده‌ها</w:t>
+      </w:r>
+      <w:r>
+        <w:rPr>
+          <w:rFonts w:cs="Arial" w:hint="cs"/>
+          <w:rtl/>
+          <w:lang w:bidi="fa-IR"/>
+        </w:rPr>
+        <w:t>ی</w:t>
+      </w:r>
+      <w:r>
+        <w:rPr>
+          <w:rFonts w:cs="Arial"/>
+          <w:rtl/>
+          <w:lang w:bidi="fa-IR"/>
+        </w:rPr>
+        <w:t xml:space="preserve"> 1 دق</w:t>
+      </w:r>
+      <w:r>
+        <w:rPr>
+          <w:rFonts w:cs="Arial" w:hint="cs"/>
+          <w:rtl/>
+          <w:lang w:bidi="fa-IR"/>
+        </w:rPr>
+        <w:t>ی</w:t>
+      </w:r>
+      <w:r>
+        <w:rPr>
+          <w:rFonts w:cs="Arial" w:hint="eastAsia"/>
+          <w:rtl/>
+          <w:lang w:bidi="fa-IR"/>
+        </w:rPr>
+        <w:t>قه‌ا</w:t>
+      </w:r>
+      <w:r>
+        <w:rPr>
+          <w:rFonts w:cs="Arial" w:hint="cs"/>
+          <w:rtl/>
+          <w:lang w:bidi="fa-IR"/>
+        </w:rPr>
+        <w:t>ی</w:t>
+      </w:r>
+    </w:p>
+    <w:p>
+      <w:pPr>
+        <w:rPr>
+          <w:lang w:bidi="fa-IR"/>
+        </w:rPr>
+      </w:pPr>
+      <w:r>
+        <w:rPr>
+          <w:lang w:bidi="fa-IR"/>
+        </w:rPr>
+        <w:t xml:space="preserve">SELECT bucket, </w:t>
+      </w:r>
+      <w:proofErr w:type="spellStart"/>
+      <w:r>
+        <w:rPr>
+          <w:lang w:bidi="fa-IR"/>
+        </w:rPr>
+        <w:t>tag_id</w:t>
+      </w:r>
+      <w:proofErr w:type="spellEnd"/>
+      <w:r>
+        <w:rPr>
+          <w:lang w:bidi="fa-IR"/>
+        </w:rPr>
+        <w:t xml:space="preserve">, </w:t>
+      </w:r>
+      <w:proofErr w:type="spellStart"/>
+      <w:r>
+        <w:rPr>
+          <w:lang w:bidi="fa-IR"/>
+        </w:rPr>
+        <w:t>avg_value</w:t>
+      </w:r>
+      <w:proofErr w:type="spellEnd"/>
+      <w:r>
+        <w:rPr>
+          <w:lang w:bidi="fa-IR"/>
+        </w:rPr>
+        <w:t xml:space="preserve">, </w:t>
+      </w:r>
+      <w:proofErr w:type="spellStart"/>
+      <w:r>
+        <w:rPr>
+          <w:lang w:bidi="fa-IR"/>
+        </w:rPr>
+        <w:t>min_value</w:t>
+      </w:r>
+      <w:proofErr w:type="spellEnd"/>
+      <w:r>
+        <w:rPr>
+          <w:lang w:bidi="fa-IR"/>
+        </w:rPr>
+        <w:t xml:space="preserve">, </w:t>
+      </w:r>
+      <w:proofErr w:type="spellStart"/>
+      <w:r>
+        <w:rPr>
+          <w:lang w:bidi="fa-IR"/>
+        </w:rPr>
+        <w:t>max_value</w:t>
+      </w:r>
+      <w:proofErr w:type="spellEnd"/>
+      <w:r>
+        <w:rPr>
+          <w:lang w:bidi="fa-IR"/>
+        </w:rPr>
+        <w:t xml:space="preserve">, </w:t>
+      </w:r>
+      <w:proofErr w:type="spellStart"/>
+      <w:r>
+        <w:rPr>
+          <w:lang w:bidi="fa-IR"/>
+        </w:rPr>
+        <w:t>sample_count</w:t>
+      </w:r>
+      <w:proofErr w:type="spellEnd"/>
+    </w:p>
+    <w:p>
+      <w:pPr>
+        <w:rPr>
+          <w:lang w:bidi="fa-IR"/>
+        </w:rPr>
+      </w:pPr>
+      <w:r>
+        <w:rPr>
+          <w:lang w:bidi="fa-IR"/>
+        </w:rPr>
+        <w:t>FROM tag_values_1min</w:t>
+      </w:r>
+    </w:p>
+    <w:p>
+      <w:pPr>
+        <w:rPr>
+          <w:lang w:bidi="fa-IR"/>
+        </w:rPr>
+      </w:pPr>
+      <w:r>
+        <w:rPr>
+          <w:lang w:bidi="fa-IR"/>
+        </w:rPr>
+        <w:t xml:space="preserve">WHERE </w:t>
+      </w:r>
+      <w:proofErr w:type="spellStart"/>
+      <w:r>
+        <w:rPr>
+          <w:lang w:bidi="fa-IR"/>
+        </w:rPr>
+        <w:t>tag_id</w:t>
+      </w:r>
+      <w:proofErr w:type="spellEnd"/>
+      <w:r>
+        <w:rPr>
+          <w:lang w:bidi="fa-IR"/>
+        </w:rPr>
+        <w:t xml:space="preserve"> = 1</w:t>
+      </w:r>
+    </w:p>
+    <w:p>
+      <w:pPr>
+        <w:rPr>
+          <w:lang w:bidi="fa-IR"/>
+        </w:rPr>
+      </w:pPr>
+      <w:r>
+        <w:rPr>
+          <w:lang w:bidi="fa-IR"/>
+        </w:rPr>
+        <w:t>ORDER BY bucket DESC</w:t>
+      </w:r>
+    </w:p>
+    <w:p>
+      <w:pPr>
+        <w:rPr>
+          <w:lang w:bidi="fa-IR"/>
+        </w:rPr>
+      </w:pPr>
+      <w:r>
+        <w:rPr>
+          <w:lang w:bidi="fa-IR"/>
+        </w:rPr>
+        <w:t>LIMIT 10;</w:t>
+      </w:r>
+    </w:p>
+    <w:p>
+      <w:pPr>
+        <w:rPr>
+          <w:lang w:bidi="fa-IR"/>
+        </w:rPr>
+      </w:pPr>
+    </w:p>
+    <w:p>
+      <w:pPr>
+        <w:rPr>
+          <w:lang w:bidi="fa-IR"/>
+        </w:rPr>
+      </w:pPr>
+      <w:r>
+        <w:rPr>
+          <w:lang w:bidi="fa-IR"/>
+        </w:rPr>
+        <w:lastRenderedPageBreak/>
+        <w:t xml:space="preserve">-- </w:t>
+      </w:r>
+      <w:r>
+        <w:rPr>
+          <w:rFonts w:cs="Arial"/>
+          <w:rtl/>
+          <w:lang w:bidi="fa-IR"/>
+        </w:rPr>
+        <w:t>داده‌ها</w:t>
+      </w:r>
+      <w:r>
+        <w:rPr>
+          <w:rFonts w:cs="Arial" w:hint="cs"/>
+          <w:rtl/>
+          <w:lang w:bidi="fa-IR"/>
+        </w:rPr>
+        <w:t>ی</w:t>
+      </w:r>
+      <w:r>
+        <w:rPr>
+          <w:rFonts w:cs="Arial"/>
+          <w:rtl/>
+          <w:lang w:bidi="fa-IR"/>
+        </w:rPr>
+        <w:t xml:space="preserve"> 5 دق</w:t>
+      </w:r>
+      <w:r>
+        <w:rPr>
+          <w:rFonts w:cs="Arial" w:hint="cs"/>
+          <w:rtl/>
+          <w:lang w:bidi="fa-IR"/>
+        </w:rPr>
+        <w:t>ی</w:t>
+      </w:r>
+      <w:r>
+        <w:rPr>
+          <w:rFonts w:cs="Arial" w:hint="eastAsia"/>
+          <w:rtl/>
+          <w:lang w:bidi="fa-IR"/>
+        </w:rPr>
+        <w:t>قه‌ا</w:t>
+      </w:r>
+      <w:r>
+        <w:rPr>
+          <w:rFonts w:cs="Arial" w:hint="cs"/>
+          <w:rtl/>
+          <w:lang w:bidi="fa-IR"/>
+        </w:rPr>
+        <w:t>ی</w:t>
+      </w:r>
+    </w:p>
+    <w:p>
+      <w:pPr>
+        <w:rPr>
+          <w:lang w:bidi="fa-IR"/>
+        </w:rPr>
+      </w:pPr>
+      <w:r>
+        <w:rPr>
+          <w:lang w:bidi="fa-IR"/>
+        </w:rPr>
+        <w:t xml:space="preserve">SELECT bucket, </w:t>
+      </w:r>
+      <w:proofErr w:type="spellStart"/>
+      <w:r>
+        <w:rPr>
+          <w:lang w:bidi="fa-IR"/>
+        </w:rPr>
+        <w:t>tag_id</w:t>
+      </w:r>
+      <w:proofErr w:type="spellEnd"/>
+      <w:r>
+        <w:rPr>
+          <w:lang w:bidi="fa-IR"/>
+        </w:rPr>
+        <w:t xml:space="preserve">, </w:t>
+      </w:r>
+      <w:proofErr w:type="spellStart"/>
+      <w:r>
+        <w:rPr>
+          <w:lang w:bidi="fa-IR"/>
+        </w:rPr>
+        <w:t>avg_value</w:t>
+      </w:r>
+      <w:proofErr w:type="spellEnd"/>
+      <w:r>
+        <w:rPr>
+          <w:lang w:bidi="fa-IR"/>
+        </w:rPr>
+        <w:t xml:space="preserve">, </w:t>
+      </w:r>
+      <w:proofErr w:type="spellStart"/>
+      <w:r>
+        <w:rPr>
+          <w:lang w:bidi="fa-IR"/>
+        </w:rPr>
+        <w:t>min_value</w:t>
+      </w:r>
+      <w:proofErr w:type="spellEnd"/>
+      <w:r>
+        <w:rPr>
+          <w:lang w:bidi="fa-IR"/>
+        </w:rPr>
+        <w:t xml:space="preserve">, </w:t>
+      </w:r>
+      <w:proofErr w:type="spellStart"/>
+      <w:r>
+        <w:rPr>
+          <w:lang w:bidi="fa-IR"/>
+        </w:rPr>
+        <w:t>max_value</w:t>
+      </w:r>
+      <w:proofErr w:type="spellEnd"/>
+      <w:r>
+        <w:rPr>
+          <w:lang w:bidi="fa-IR"/>
+        </w:rPr>
+        <w:t xml:space="preserve">, </w:t>
+      </w:r>
+      <w:proofErr w:type="spellStart"/>
+      <w:r>
+        <w:rPr>
+          <w:lang w:bidi="fa-IR"/>
+        </w:rPr>
+        <w:t>sample_count</w:t>
+      </w:r>
+      <w:proofErr w:type="spellEnd"/>
+    </w:p>
+    <w:p>
+      <w:pPr>
+        <w:rPr>
+          <w:lang w:bidi="fa-IR"/>
+        </w:rPr>
+      </w:pPr>
+      <w:r>
+        <w:rPr>
+          <w:lang w:bidi="fa-IR"/>
+        </w:rPr>
+        <w:t>FROM tag_values_5min</w:t>
+      </w:r>
+    </w:p>
+    <w:p>
+      <w:pPr>
+        <w:rPr>
+          <w:lang w:bidi="fa-IR"/>
+        </w:rPr>
+      </w:pPr>
+      <w:r>
+        <w:rPr>
+          <w:lang w:bidi="fa-IR"/>
+        </w:rPr>
+        <w:t xml:space="preserve">WHERE </w:t>
+      </w:r>
+      <w:proofErr w:type="spellStart"/>
+      <w:r>
+        <w:rPr>
+          <w:lang w:bidi="fa-IR"/>
+        </w:rPr>
+        <w:t>tag_id</w:t>
+      </w:r>
+      <w:proofErr w:type="spellEnd"/>
+      <w:r>
+        <w:rPr>
+          <w:lang w:bidi="fa-IR"/>
+        </w:rPr>
+        <w:t xml:space="preserve"> = 1</w:t>
+      </w:r>
+    </w:p>
+    <w:p>
+      <w:pPr>
+        <w:rPr>
+          <w:lang w:bidi="fa-IR"/>
+        </w:rPr>
+      </w:pPr>
+      <w:r>
+        <w:rPr>
+          <w:lang w:bidi="fa-IR"/>
+        </w:rPr>
+        <w:t>ORDER BY bucket DESC</w:t>
+      </w:r>
+    </w:p>
+    <w:p>
+      <w:pPr>
+        <w:rPr>
+          <w:lang w:bidi="fa-IR"/>
+        </w:rPr>
+      </w:pPr>
+      <w:r>
+        <w:rPr>
+          <w:lang w:bidi="fa-IR"/>
+        </w:rPr>
+        <w:t>LIMIT 10;</w:t>
+      </w:r>
+    </w:p>
+    <w:p>
+      <w:pPr>
+        <w:rPr>
+          <w:lang w:bidi="fa-IR"/>
+        </w:rPr>
+      </w:pPr>
+    </w:p>
+    <w:p>
+      <w:pPr>
+        <w:rPr>
+          <w:lang w:bidi="fa-IR"/>
+        </w:rPr>
+      </w:pPr>
+      <w:r>
+        <w:rPr>
+          <w:lang w:bidi="fa-IR"/>
+        </w:rPr>
+        <w:t xml:space="preserve">-- </w:t>
+      </w:r>
+      <w:r>
+        <w:rPr>
+          <w:rFonts w:cs="Arial"/>
+          <w:rtl/>
+          <w:lang w:bidi="fa-IR"/>
+        </w:rPr>
+        <w:t>داده‌ها</w:t>
+      </w:r>
+      <w:r>
+        <w:rPr>
+          <w:rFonts w:cs="Arial" w:hint="cs"/>
+          <w:rtl/>
+          <w:lang w:bidi="fa-IR"/>
+        </w:rPr>
+        <w:t>ی</w:t>
+      </w:r>
+      <w:r>
+        <w:rPr>
+          <w:rFonts w:cs="Arial"/>
+          <w:rtl/>
+          <w:lang w:bidi="fa-IR"/>
+        </w:rPr>
+        <w:t xml:space="preserve"> 1 ساعته</w:t>
+      </w:r>
+    </w:p>
+    <w:p>
+      <w:pPr>
+        <w:rPr>
+          <w:lang w:bidi="fa-IR"/>
+        </w:rPr>
+      </w:pPr>
+      <w:r>
+        <w:rPr>
+          <w:lang w:bidi="fa-IR"/>
+        </w:rPr>
+        <w:t xml:space="preserve">SELECT bucket, </w:t>
+      </w:r>
+      <w:proofErr w:type="spellStart"/>
+      <w:r>
+        <w:rPr>
+          <w:lang w:bidi="fa-IR"/>
+        </w:rPr>
+        <w:t>tag_id</w:t>
+      </w:r>
+      <w:proofErr w:type="spellEnd"/>
+      <w:r>
+        <w:rPr>
+          <w:lang w:bidi="fa-IR"/>
+        </w:rPr>
+        <w:t xml:space="preserve">, </w:t>
+      </w:r>
+      <w:proofErr w:type="spellStart"/>
+      <w:r>
+        <w:rPr>
+          <w:lang w:bidi="fa-IR"/>
+        </w:rPr>
+        <w:t>avg_value</w:t>
+      </w:r>
+      <w:proofErr w:type="spellEnd"/>
+      <w:r>
+        <w:rPr>
+          <w:lang w:bidi="fa-IR"/>
+        </w:rPr>
+        <w:t xml:space="preserve">, </w:t>
+      </w:r>
+      <w:proofErr w:type="spellStart"/>
+      <w:r>
+        <w:rPr>
+          <w:lang w:bidi="fa-IR"/>
+        </w:rPr>
+        <w:t>min_value</w:t>
+      </w:r>
+      <w:proofErr w:type="spellEnd"/>
+      <w:r>
+        <w:rPr>
+          <w:lang w:bidi="fa-IR"/>
+        </w:rPr>
+        <w:t xml:space="preserve">, </w:t>
+      </w:r>
+      <w:proofErr w:type="spellStart"/>
+      <w:r>
+        <w:rPr>
+          <w:lang w:bidi="fa-IR"/>
+        </w:rPr>
+        <w:t>max_value</w:t>
+      </w:r>
+      <w:proofErr w:type="spellEnd"/>
+      <w:r>
+        <w:rPr>
+          <w:lang w:bidi="fa-IR"/>
+        </w:rPr>
+        <w:t xml:space="preserve">, </w:t>
+      </w:r>
+      <w:proofErr w:type="spellStart"/>
+      <w:r>
+        <w:rPr>
+          <w:lang w:bidi="fa-IR"/>
+        </w:rPr>
+        <w:t>sample_count</w:t>
+      </w:r>
+      <w:proofErr w:type="spellEnd"/>
+    </w:p>
+    <w:p>
+      <w:pPr>
+        <w:rPr>
+          <w:lang w:bidi="fa-IR"/>
+        </w:rPr>
+      </w:pPr>
+      <w:r>
+        <w:rPr>
+          <w:lang w:bidi="fa-IR"/>
+        </w:rPr>
+        <w:t>FROM tag_values_1hour</w:t>
+      </w:r>
+    </w:p>
+    <w:p>
+      <w:pPr>
+        <w:rPr>
+          <w:lang w:bidi="fa-IR"/>
+        </w:rPr>
+      </w:pPr>
+      <w:r>
+        <w:rPr>
+          <w:lang w:bidi="fa-IR"/>
+        </w:rPr>
+        <w:t xml:space="preserve">WHERE </w:t>
+      </w:r>
+      <w:proofErr w:type="spellStart"/>
+      <w:r>
+        <w:rPr>
+          <w:lang w:bidi="fa-IR"/>
+        </w:rPr>
+        <w:t>tag_id</w:t>
+      </w:r>
+      <w:proofErr w:type="spellEnd"/>
+      <w:r>
+        <w:rPr>
+          <w:lang w:bidi="fa-IR"/>
+        </w:rPr>
+        <w:t xml:space="preserve"> = 1</w:t>
+      </w:r>
+    </w:p>
+    <w:p>
+      <w:pPr>
+        <w:rPr>
+          <w:lang w:bidi="fa-IR"/>
+        </w:rPr>
+      </w:pPr>
+      <w:r>
+        <w:rPr>
+          <w:lang w:bidi="fa-IR"/>
+        </w:rPr>
+        <w:t>ORDER BY bucket DESC</w:t>
+      </w:r>
+    </w:p>
+    <w:p>
+      <w:pPr>
+        <w:rPr>
+          <w:lang w:bidi="fa-IR"/>
+        </w:rPr>
+      </w:pPr>
+      <w:r>
+        <w:rPr>
+          <w:lang w:bidi="fa-IR"/>
+        </w:rPr>
+        <w:t>LIMIT 10;</w:t>
+      </w:r>
+    </w:p>
+    <w:p>
+      <w:pPr>
+        <w:rPr>
+          <w:lang w:bidi="fa-IR"/>
+        </w:rPr>
+      </w:pPr>
+    </w:p>
+    <w:p>
+      <w:pPr>
+        <w:rPr>
+          <w:lang w:bidi="fa-IR"/>
+        </w:rPr>
+      </w:pPr>
+      <w:r>
+        <w:rPr>
+          <w:lang w:bidi="fa-IR"/>
+        </w:rPr>
+        <w:t xml:space="preserve">-- </w:t>
+      </w:r>
+      <w:r>
+        <w:rPr>
+          <w:rFonts w:cs="Arial"/>
+          <w:rtl/>
+          <w:lang w:bidi="fa-IR"/>
+        </w:rPr>
+        <w:t>داده‌ها</w:t>
+      </w:r>
+      <w:r>
+        <w:rPr>
+          <w:rFonts w:cs="Arial" w:hint="cs"/>
+          <w:rtl/>
+          <w:lang w:bidi="fa-IR"/>
+        </w:rPr>
+        <w:t>ی</w:t>
+      </w:r>
+      <w:r>
+        <w:rPr>
+          <w:rFonts w:cs="Arial"/>
+          <w:rtl/>
+          <w:lang w:bidi="fa-IR"/>
+        </w:rPr>
+        <w:t xml:space="preserve"> 1 روزه</w:t>
+      </w:r>
+    </w:p>
+    <w:p>
+      <w:pPr>
+        <w:rPr>
+          <w:lang w:bidi="fa-IR"/>
+        </w:rPr>
+      </w:pPr>
+      <w:r>
+        <w:rPr>
+          <w:lang w:bidi="fa-IR"/>
+        </w:rPr>
+        <w:t xml:space="preserve">SELECT bucket, </w:t>
+      </w:r>
+      <w:proofErr w:type="spellStart"/>
+      <w:r>
+        <w:rPr>
+          <w:lang w:bidi="fa-IR"/>
+        </w:rPr>
+        <w:t>tag_id</w:t>
+      </w:r>
+      <w:proofErr w:type="spellEnd"/>
+      <w:r>
+        <w:rPr>
+          <w:lang w:bidi="fa-IR"/>
+        </w:rPr>
+        <w:t xml:space="preserve">, </w:t>
+      </w:r>
+      <w:proofErr w:type="spellStart"/>
+      <w:r>
+        <w:rPr>
+          <w:lang w:bidi="fa-IR"/>
+        </w:rPr>
+        <w:t>avg_value</w:t>
+      </w:r>
+      <w:proofErr w:type="spellEnd"/>
+      <w:r>
+        <w:rPr>
+          <w:lang w:bidi="fa-IR"/>
+        </w:rPr>
+        <w:t xml:space="preserve">, </w:t>
+      </w:r>
+      <w:proofErr w:type="spellStart"/>
+      <w:r>
+        <w:rPr>
+          <w:lang w:bidi="fa-IR"/>
+        </w:rPr>
+        <w:t>min_value</w:t>
+      </w:r>
+      <w:proofErr w:type="spellEnd"/>
+      <w:r>
+        <w:rPr>
+          <w:lang w:bidi="fa-IR"/>
+        </w:rPr>
+        <w:t xml:space="preserve">, </w:t>
+      </w:r>
+      <w:proofErr w:type="spellStart"/>
+      <w:r>
+        <w:rPr>
+          <w:lang w:bidi="fa-IR"/>
+        </w:rPr>
+        <w:t>max_value</w:t>
+      </w:r>
+      <w:proofErr w:type="spellEnd"/>
+      <w:r>
+        <w:rPr>
+          <w:lang w:bidi="fa-IR"/>
+        </w:rPr>
+        <w:t xml:space="preserve">, </w:t>
+      </w:r>
+      <w:proofErr w:type="spellStart"/>
+      <w:r>
+        <w:rPr>
+          <w:lang w:bidi="fa-IR"/>
+        </w:rPr>
+        <w:t>sample_count</w:t>
+      </w:r>
+      <w:proofErr w:type="spellEnd"/>
+    </w:p>
+    <w:p>
+      <w:pPr>
+        <w:rPr>
+          <w:lang w:bidi="fa-IR"/>
+        </w:rPr>
+      </w:pPr>
+      <w:r>
+        <w:rPr>
+          <w:lang w:bidi="fa-IR"/>
+        </w:rPr>
+        <w:t>FROM tag_values_1day</w:t>
+      </w:r>
+    </w:p>
+    <w:p>
+      <w:pPr>
+        <w:rPr>
+          <w:lang w:bidi="fa-IR"/>
+        </w:rPr>
+      </w:pPr>
+      <w:r>
+        <w:rPr>
+          <w:lang w:bidi="fa-IR"/>
+        </w:rPr>
+        <w:t xml:space="preserve">WHERE </w:t>
+      </w:r>
+      <w:proofErr w:type="spellStart"/>
+      <w:r>
+        <w:rPr>
+          <w:lang w:bidi="fa-IR"/>
+        </w:rPr>
+        <w:t>tag_id</w:t>
+      </w:r>
+      <w:proofErr w:type="spellEnd"/>
+      <w:r>
+        <w:rPr>
+          <w:lang w:bidi="fa-IR"/>
+        </w:rPr>
+        <w:t xml:space="preserve"> = 1</w:t>
+      </w:r>
+    </w:p>
+    <w:p>
+      <w:pPr>
+        <w:rPr>
+          <w:lang w:bidi="fa-IR"/>
+        </w:rPr>
+      </w:pPr>
+      <w:r>
+        <w:rPr>
+          <w:lang w:bidi="fa-IR"/>
+        </w:rPr>
+        <w:t>ORDER BY bucket DESC</w:t>
+      </w:r>
+    </w:p>
+    <w:p>
+      <w:pPr>
+        <w:rPr>
+          <w:lang w:bidi="fa-IR"/>
+        </w:rPr>
+      </w:pPr>
+      <w:r>
+        <w:rPr>
+          <w:lang w:bidi="fa-IR"/>
+        </w:rPr>
+        <w:t>LIMIT 10;</w:t>
+      </w:r>
+    </w:p>
+    <w:p>
+      <w:pPr>
+        <w:rPr>
+          <w:lang w:bidi="fa-IR"/>
+        </w:rPr>
+      </w:pPr>
+    </w:p>
+    <w:p>
+      <w:pPr>
+        <w:rPr>
+          <w:rFonts w:ascii="Arial" w:hAnsi="Arial" w:cs="Arial"/>
+          <w:color w:val="1D1D1F"/>
+          <w:shd w:val="clear" w:color="auto" w:fill="FFFFFF"/>
+        </w:rPr>
+      </w:pPr>
+      <w:r>
+        <w:rPr>
+          <w:rFonts w:ascii="Arial" w:hAnsi="Arial" w:cs="Arial"/>
+          <w:color w:val="1D1D1F"/>
+          <w:shd w:val="clear" w:color="auto" w:fill="FFFFFF"/>
+          <w:rtl/>
+        </w:rPr>
+        <w:t>اگر می‌خواهید داده‌های</w:t>
+      </w:r>
+      <w:r>
+        <w:rPr>
+          <w:rFonts w:ascii="Arial" w:hAnsi="Arial" w:cs="Arial"/>
+          <w:color w:val="1D1D1F"/>
+          <w:shd w:val="clear" w:color="auto" w:fill="FFFFFF"/>
+        </w:rPr>
+        <w:t xml:space="preserve"> aggregate </w:t>
+      </w:r>
+      <w:r>
+        <w:rPr>
+          <w:rFonts w:ascii="Arial" w:hAnsi="Arial" w:cs="Arial"/>
+          <w:color w:val="1D1D1F"/>
+          <w:shd w:val="clear" w:color="auto" w:fill="FFFFFF"/>
+          <w:rtl/>
+        </w:rPr>
+        <w:t>را فوراً</w:t>
+      </w:r>
+      <w:r>
+        <w:rPr>
+          <w:rFonts w:ascii="Arial" w:hAnsi="Arial" w:cs="Arial"/>
+          <w:color w:val="1D1D1F"/>
+          <w:shd w:val="clear" w:color="auto" w:fill="FFFFFF"/>
+        </w:rPr>
+        <w:t xml:space="preserve"> refresh </w:t>
+      </w:r>
+      <w:r>
+        <w:rPr>
+          <w:rFonts w:ascii="Arial" w:hAnsi="Arial" w:cs="Arial"/>
+          <w:color w:val="1D1D1F"/>
+          <w:shd w:val="clear" w:color="auto" w:fill="FFFFFF"/>
+          <w:rtl/>
+        </w:rPr>
+        <w:t>کنید</w:t>
+      </w:r>
+      <w:r>
+        <w:rPr>
+          <w:rFonts w:ascii="Arial" w:hAnsi="Arial" w:cs="Arial"/>
+          <w:color w:val="1D1D1F"/>
+          <w:shd w:val="clear" w:color="auto" w:fill="FFFFFF"/>
+        </w:rPr>
+        <w:t>:</w:t>
+      </w:r>
+    </w:p>
+    <w:p>
+      <w:pPr>
+        <w:rPr>
+          <w:lang w:bidi="fa-IR"/>
+        </w:rPr>
+      </w:pPr>
+      <w:r>
+        <w:rPr>
+          <w:lang w:bidi="fa-IR"/>
+        </w:rPr>
+        <w:t xml:space="preserve">CALL </w:t>
+      </w:r>
+      <w:proofErr w:type="spellStart"/>
+      <w:r>
+        <w:rPr>
+          <w:lang w:bidi="fa-IR"/>
+        </w:rPr>
+        <w:t>refresh_continuous_</w:t>
+      </w:r>
+      <w:proofErr w:type="gramStart"/>
+      <w:r>
+        <w:rPr>
+          <w:lang w:bidi="fa-IR"/>
+        </w:rPr>
+        <w:t>aggregate</w:t>
+      </w:r>
+      <w:proofErr w:type="spellEnd"/>
+      <w:r>
+        <w:rPr>
+          <w:lang w:bidi="fa-IR"/>
+        </w:rPr>
+        <w:t>(</w:t>
+      </w:r>
+      <w:proofErr w:type="gramEnd"/>
+      <w:r>
+        <w:rPr>
+          <w:lang w:bidi="fa-IR"/>
+        </w:rPr>
+        <w:t>'tag_values_1min', NULL, NULL);</w:t>
+      </w:r>
+    </w:p>
+    <w:p>
+      <w:pPr>
+        <w:rPr>
+          <w:lang w:bidi="fa-IR"/>
+        </w:rPr>
+      </w:pPr>
+      <w:r>
+        <w:rPr>
+          <w:lang w:bidi="fa-IR"/>
+        </w:rPr>
+        <w:t xml:space="preserve">CALL </w:t>
+      </w:r>
+      <w:proofErr w:type="spellStart"/>
+      <w:r>
+        <w:rPr>
+          <w:lang w:bidi="fa-IR"/>
+        </w:rPr>
+        <w:t>refresh_continuous_</w:t>
+      </w:r>
+      <w:proofErr w:type="gramStart"/>
+      <w:r>
+        <w:rPr>
+          <w:lang w:bidi="fa-IR"/>
+        </w:rPr>
+        <w:t>aggregate</w:t>
+      </w:r>
+      <w:proofErr w:type="spellEnd"/>
+      <w:r>
+        <w:rPr>
+          <w:lang w:bidi="fa-IR"/>
+        </w:rPr>
+        <w:t>(</w:t>
+      </w:r>
+      <w:proofErr w:type="gramEnd"/>
+      <w:r>
+        <w:rPr>
+          <w:lang w:bidi="fa-IR"/>
+        </w:rPr>
+        <w:t>'tag_values_5min', NULL, NULL);</w:t>
+      </w:r>
+    </w:p>
+    <w:p>
+      <w:pPr>
+        <w:rPr>
+          <w:lang w:bidi="fa-IR"/>
+        </w:rPr>
+      </w:pPr>
+      <w:r>
+        <w:rPr>
+          <w:lang w:bidi="fa-IR"/>
+        </w:rPr>
+        <w:t xml:space="preserve">CALL </w:t>
+      </w:r>
+      <w:proofErr w:type="spellStart"/>
+      <w:r>
+        <w:rPr>
+          <w:lang w:bidi="fa-IR"/>
+        </w:rPr>
+        <w:t>refresh_continuous_</w:t>
+      </w:r>
+      <w:proofErr w:type="gramStart"/>
+      <w:r>
+        <w:rPr>
+          <w:lang w:bidi="fa-IR"/>
+        </w:rPr>
+        <w:t>aggregate</w:t>
+      </w:r>
+      <w:proofErr w:type="spellEnd"/>
+      <w:r>
+        <w:rPr>
+          <w:lang w:bidi="fa-IR"/>
+        </w:rPr>
+        <w:t>(</w:t>
+      </w:r>
+      <w:proofErr w:type="gramEnd"/>
+      <w:r>
+        <w:rPr>
+          <w:lang w:bidi="fa-IR"/>
+        </w:rPr>
+        <w:t>'tag_values_1hour', NULL, NULL);</w:t>
+      </w:r>
+    </w:p>
+    <w:p>
+      <w:pPr>
+        <w:rPr>
+          <w:rtl/>
+          <w:lang w:bidi="fa-IR"/>
+        </w:rPr>
+      </w:pPr>
+      <w:r>
+        <w:rPr>
+          <w:lang w:bidi="fa-IR"/>
+        </w:rPr>
+        <w:t xml:space="preserve">CALL </w:t>
+      </w:r>
+      <w:proofErr w:type="spellStart"/>
+      <w:r>
+        <w:rPr>
+          <w:lang w:bidi="fa-IR"/>
+        </w:rPr>
+        <w:t>refresh_continuous_</w:t>
+      </w:r>
+      <w:proofErr w:type="gramStart"/>
+      <w:r>
+        <w:rPr>
+          <w:lang w:bidi="fa-IR"/>
+        </w:rPr>
+        <w:t>aggregate</w:t>
+      </w:r>
+      <w:proofErr w:type="spellEnd"/>
+      <w:r>
+        <w:rPr>
+          <w:lang w:bidi="fa-IR"/>
+        </w:rPr>
+        <w:t>(</w:t>
+      </w:r>
+      <w:proofErr w:type="gramEnd"/>
+      <w:r>
+        <w:rPr>
+          <w:lang w:bidi="fa-IR"/>
+        </w:rPr>
+        <w:t>'tag_values_1day', NULL, NULL);</w:t>
+      </w:r>
+    </w:p>
+    <w:p>
+      <w:pPr>
+        <w:rPr>
+          <w:rtl/>
+          <w:lang w:bidi="fa-IR"/>
+        </w:rPr>
+      </w:pPr>
+    </w:p>
+    <w:p>
+      <w:pPr>
+        <w:rPr>
+          <w:rtl/>
+          <w:lang w:bidi="fa-IR"/>
+        </w:rPr>
+      </w:pPr>
+    </w:p>
+    <w:p>
+      <w:pPr>
+        <w:rPr>
+          <w:lang w:bidi="fa-IR"/>
+        </w:rPr>
+      </w:pPr>
+      <w:r>
+        <w:rPr>
+          <w:lang w:bidi="fa-IR"/>
+        </w:rPr>
+        <w:t xml:space="preserve">// </w:t>
+      </w:r>
+      <w:r>
+        <w:rPr>
+          <w:rFonts w:cs="Arial"/>
+          <w:rtl/>
+          <w:lang w:bidi="fa-IR"/>
+        </w:rPr>
+        <w:t>همه</w:t>
+      </w:r>
+      <w:r>
+        <w:rPr>
+          <w:lang w:bidi="fa-IR"/>
+        </w:rPr>
+        <w:t xml:space="preserve"> views </w:t>
+      </w:r>
+      <w:r>
+        <w:rPr>
+          <w:rFonts w:cs="Arial"/>
+          <w:rtl/>
+          <w:lang w:bidi="fa-IR"/>
+        </w:rPr>
+        <w:t>را</w:t>
+      </w:r>
+      <w:r>
+        <w:rPr>
+          <w:lang w:bidi="fa-IR"/>
+        </w:rPr>
+        <w:t xml:space="preserve"> refresh </w:t>
+      </w:r>
+      <w:r>
+        <w:rPr>
+          <w:rFonts w:cs="Arial"/>
+          <w:rtl/>
+          <w:lang w:bidi="fa-IR"/>
+        </w:rPr>
+        <w:t>کن</w:t>
+      </w:r>
+    </w:p>
+    <w:p>
+      <w:pPr>
+        <w:rPr>
+          <w:lang w:bidi="fa-IR"/>
+        </w:rPr>
+      </w:pPr>
+      <w:proofErr w:type="spellStart"/>
+      <w:r>
+        <w:rPr>
+          <w:lang w:bidi="fa-IR"/>
+        </w:rPr>
+        <w:lastRenderedPageBreak/>
+        <w:t>m_historianManager</w:t>
+      </w:r>
+      <w:proofErr w:type="spellEnd"/>
+      <w:r>
+        <w:rPr>
+          <w:lang w:bidi="fa-IR"/>
+        </w:rPr>
+        <w:t>-&gt;</w:t>
+      </w:r>
+      <w:proofErr w:type="spellStart"/>
+      <w:proofErr w:type="gramStart"/>
+      <w:r>
+        <w:rPr>
+          <w:lang w:bidi="fa-IR"/>
+        </w:rPr>
+        <w:t>refreshContinuousAggregates</w:t>
+      </w:r>
+      <w:proofErr w:type="spellEnd"/>
+      <w:r>
+        <w:rPr>
+          <w:lang w:bidi="fa-IR"/>
+        </w:rPr>
+        <w:t>(</w:t>
+      </w:r>
+      <w:proofErr w:type="gramEnd"/>
+      <w:r>
+        <w:rPr>
+          <w:lang w:bidi="fa-IR"/>
+        </w:rPr>
+        <w:t>);</w:t>
+      </w:r>
+    </w:p>
+    <w:p>
+      <w:pPr>
+        <w:rPr>
+          <w:lang w:bidi="fa-IR"/>
+        </w:rPr>
+      </w:pPr>
+    </w:p>
+    <w:p>
+      <w:pPr>
+        <w:rPr>
+          <w:lang w:bidi="fa-IR"/>
+        </w:rPr>
+      </w:pPr>
+      <w:r>
+        <w:rPr>
+          <w:lang w:bidi="fa-IR"/>
+        </w:rPr>
+        <w:t xml:space="preserve">// </w:t>
+      </w:r>
+      <w:r>
+        <w:rPr>
+          <w:rFonts w:cs="Arial"/>
+          <w:rtl/>
+          <w:lang w:bidi="fa-IR"/>
+        </w:rPr>
+        <w:t xml:space="preserve">فقط </w:t>
+      </w:r>
+      <w:r>
+        <w:rPr>
+          <w:rFonts w:cs="Arial" w:hint="cs"/>
+          <w:rtl/>
+          <w:lang w:bidi="fa-IR"/>
+        </w:rPr>
+        <w:t>ی</w:t>
+      </w:r>
+      <w:r>
+        <w:rPr>
+          <w:rFonts w:cs="Arial" w:hint="eastAsia"/>
+          <w:rtl/>
+          <w:lang w:bidi="fa-IR"/>
+        </w:rPr>
+        <w:t>ک</w:t>
+      </w:r>
+      <w:r>
+        <w:rPr>
+          <w:lang w:bidi="fa-IR"/>
+        </w:rPr>
+        <w:t xml:space="preserve"> view </w:t>
+      </w:r>
+      <w:r>
+        <w:rPr>
+          <w:rFonts w:cs="Arial"/>
+          <w:rtl/>
+          <w:lang w:bidi="fa-IR"/>
+        </w:rPr>
+        <w:t>را</w:t>
+      </w:r>
+      <w:r>
+        <w:rPr>
+          <w:lang w:bidi="fa-IR"/>
+        </w:rPr>
+        <w:t xml:space="preserve"> refresh </w:t>
+      </w:r>
+      <w:r>
+        <w:rPr>
+          <w:rFonts w:cs="Arial"/>
+          <w:rtl/>
+          <w:lang w:bidi="fa-IR"/>
+        </w:rPr>
+        <w:t>کن</w:t>
+      </w:r>
+    </w:p>
+    <w:p>
+      <w:pPr>
+        <w:rPr>
+          <w:lang w:bidi="fa-IR"/>
+        </w:rPr>
+      </w:pPr>
+      <w:r>
+        <w:rPr>
+          <w:lang w:bidi="fa-IR"/>
+        </w:rPr>
+        <w:t>m_historianManager-&gt;refreshContinuousAggregate("tag_values_1min");</w:t>
+      </w:r>
+    </w:p>
+    <w:p>
+      <w:pPr>
+        <w:rPr>
+          <w:lang w:bidi="fa-IR"/>
+        </w:rPr>
+      </w:pPr>
+    </w:p>
+    <w:p>
+      <w:pPr>
+        <w:rPr>
+          <w:lang w:bidi="fa-IR"/>
+        </w:rPr>
+      </w:pPr>
+      <w:r>
+        <w:rPr>
+          <w:lang w:bidi="fa-IR"/>
+        </w:rPr>
+        <w:t xml:space="preserve">// </w:t>
+      </w:r>
+      <w:r>
+        <w:rPr>
+          <w:rFonts w:cs="Arial" w:hint="cs"/>
+          <w:rtl/>
+          <w:lang w:bidi="fa-IR"/>
+        </w:rPr>
+        <w:t>ی</w:t>
+      </w:r>
+      <w:r>
+        <w:rPr>
+          <w:rFonts w:cs="Arial" w:hint="eastAsia"/>
+          <w:rtl/>
+          <w:lang w:bidi="fa-IR"/>
+        </w:rPr>
+        <w:t>ک</w:t>
+      </w:r>
+      <w:r>
+        <w:rPr>
+          <w:lang w:bidi="fa-IR"/>
+        </w:rPr>
+        <w:t xml:space="preserve"> view </w:t>
+      </w:r>
+      <w:r>
+        <w:rPr>
+          <w:rFonts w:cs="Arial"/>
+          <w:rtl/>
+          <w:lang w:bidi="fa-IR"/>
+        </w:rPr>
+        <w:t xml:space="preserve">را در </w:t>
+      </w:r>
+      <w:r>
+        <w:rPr>
+          <w:rFonts w:cs="Arial" w:hint="cs"/>
+          <w:rtl/>
+          <w:lang w:bidi="fa-IR"/>
+        </w:rPr>
+        <w:t>ی</w:t>
+      </w:r>
+      <w:r>
+        <w:rPr>
+          <w:rFonts w:cs="Arial" w:hint="eastAsia"/>
+          <w:rtl/>
+          <w:lang w:bidi="fa-IR"/>
+        </w:rPr>
+        <w:t>ک</w:t>
+      </w:r>
+      <w:r>
+        <w:rPr>
+          <w:rFonts w:cs="Arial"/>
+          <w:rtl/>
+          <w:lang w:bidi="fa-IR"/>
+        </w:rPr>
+        <w:t xml:space="preserve"> بازه زمان</w:t>
+      </w:r>
+      <w:r>
+        <w:rPr>
+          <w:rFonts w:cs="Arial" w:hint="cs"/>
+          <w:rtl/>
+          <w:lang w:bidi="fa-IR"/>
+        </w:rPr>
+        <w:t>ی</w:t>
+      </w:r>
+      <w:r>
+        <w:rPr>
+          <w:lang w:bidi="fa-IR"/>
+        </w:rPr>
+        <w:t xml:space="preserve"> refresh </w:t>
+      </w:r>
+      <w:r>
+        <w:rPr>
+          <w:rFonts w:cs="Arial"/>
+          <w:rtl/>
+          <w:lang w:bidi="fa-IR"/>
+        </w:rPr>
+        <w:t>کن</w:t>
+      </w:r>
+    </w:p>
+    <w:p>
+      <w:pPr>
+        <w:rPr>
+          <w:lang w:bidi="fa-IR"/>
+        </w:rPr>
+      </w:pPr>
+      <w:proofErr w:type="spellStart"/>
+      <w:r>
+        <w:rPr>
+          <w:lang w:bidi="fa-IR"/>
+        </w:rPr>
+        <w:t>m_historianManager</w:t>
+      </w:r>
+      <w:proofErr w:type="spellEnd"/>
+      <w:r>
+        <w:rPr>
+          <w:lang w:bidi="fa-IR"/>
+        </w:rPr>
+        <w:t>-&gt;</w:t>
+      </w:r>
+      <w:proofErr w:type="spellStart"/>
+      <w:proofErr w:type="gramStart"/>
+      <w:r>
+        <w:rPr>
+          <w:lang w:bidi="fa-IR"/>
+        </w:rPr>
+        <w:t>refreshContinuousAggregate</w:t>
+      </w:r>
+      <w:proofErr w:type="spellEnd"/>
+      <w:r>
+        <w:rPr>
+          <w:lang w:bidi="fa-IR"/>
+        </w:rPr>
+        <w:t>(</w:t>
+      </w:r>
+      <w:proofErr w:type="gramEnd"/>
+    </w:p>
+    <w:p>
+      <w:pPr>
+        <w:rPr>
+          <w:lang w:bidi="fa-IR"/>
+        </w:rPr>
+      </w:pPr>
+      <w:r>
+        <w:rPr>
+          <w:lang w:bidi="fa-IR"/>
+        </w:rPr>
+        <w:t xml:space="preserve">    "tag_values_1min",</w:t>
+      </w:r>
+    </w:p>
+    <w:p>
+      <w:pPr>
+        <w:rPr>
+          <w:lang w:bidi="fa-IR"/>
+        </w:rPr>
+      </w:pPr>
+      <w:r>
+        <w:rPr>
+          <w:lang w:bidi="fa-IR"/>
+        </w:rPr>
+        <w:t xml:space="preserve">    </w:t>
+      </w:r>
+      <w:proofErr w:type="spellStart"/>
+      <w:proofErr w:type="gramStart"/>
+      <w:r>
+        <w:rPr>
+          <w:lang w:bidi="fa-IR"/>
+        </w:rPr>
+        <w:t>QDateTime</w:t>
+      </w:r>
+      <w:proofErr w:type="spellEnd"/>
+      <w:r>
+        <w:rPr>
+          <w:lang w:bidi="fa-IR"/>
+        </w:rPr>
+        <w:t>::</w:t>
+      </w:r>
+      <w:proofErr w:type="spellStart"/>
+      <w:proofErr w:type="gramEnd"/>
+      <w:r>
+        <w:rPr>
+          <w:lang w:bidi="fa-IR"/>
+        </w:rPr>
+        <w:t>currentDateTimeUtc</w:t>
+      </w:r>
+      <w:proofErr w:type="spellEnd"/>
+      <w:r>
+        <w:rPr>
+          <w:lang w:bidi="fa-IR"/>
+        </w:rPr>
+        <w:t>().</w:t>
+      </w:r>
+      <w:proofErr w:type="spellStart"/>
+      <w:r>
+        <w:rPr>
+          <w:lang w:bidi="fa-IR"/>
+        </w:rPr>
+        <w:t>addDays</w:t>
+      </w:r>
+      <w:proofErr w:type="spellEnd"/>
+      <w:r>
+        <w:rPr>
+          <w:lang w:bidi="fa-IR"/>
+        </w:rPr>
+        <w:t>(-1),</w:t>
+      </w:r>
+    </w:p>
+    <w:p>
+      <w:pPr>
+        <w:rPr>
+          <w:lang w:bidi="fa-IR"/>
+        </w:rPr>
+      </w:pPr>
+      <w:r>
+        <w:rPr>
+          <w:lang w:bidi="fa-IR"/>
+        </w:rPr>
+        <w:t xml:space="preserve">    </w:t>
+      </w:r>
+      <w:proofErr w:type="spellStart"/>
+      <w:proofErr w:type="gramStart"/>
+      <w:r>
+        <w:rPr>
+          <w:lang w:bidi="fa-IR"/>
+        </w:rPr>
+        <w:t>QDateTime</w:t>
+      </w:r>
+      <w:proofErr w:type="spellEnd"/>
+      <w:r>
+        <w:rPr>
+          <w:lang w:bidi="fa-IR"/>
+        </w:rPr>
+        <w:t>::</w:t>
+      </w:r>
+      <w:proofErr w:type="spellStart"/>
+      <w:proofErr w:type="gramEnd"/>
+      <w:r>
+        <w:rPr>
+          <w:lang w:bidi="fa-IR"/>
+        </w:rPr>
+        <w:t>currentDateTimeUtc</w:t>
+      </w:r>
+      <w:proofErr w:type="spellEnd"/>
+      <w:r>
+        <w:rPr>
+          <w:lang w:bidi="fa-IR"/>
+        </w:rPr>
+        <w:t>()</w:t>
+      </w:r>
+    </w:p>
+    <w:p>
+      <w:pPr>
+        <w:rPr>
+          <w:rtl/>
+          <w:lang w:bidi="fa-IR"/>
+        </w:rPr>
+      </w:pPr>
+      <w:r>
+        <w:rPr>
+          <w:lang w:bidi="fa-IR"/>
+        </w:rPr>
+        <w:t>);</w:t>
+      </w:r>
+    </w:p>
+    <w:p>
+      <w:pPr>
+        <w:rPr>
+          <w:rtl/>
+          <w:lang w:bidi="fa-IR"/>
+        </w:rPr>
+      </w:pPr>
+    </w:p>
+    <w:p>
+      <w:pPr>
+        <w:rPr>
+          <w:rtl/>
+          <w:lang w:bidi="fa-IR"/>
+        </w:rPr>
+      </w:pPr>
+    </w:p>
+    <w:p>
+      <w:pPr>
+        <w:rPr>
+          <w:lang w:bidi="fa-IR"/>
+        </w:rPr>
+      </w:pPr>
+      <w:bookmarkStart w:id="0" w:name="_GoBack"/>
+      <w:bookmarkEnd w:id="0"/>
+    </w:p>
+    <w:p>
+      <w:pPr>
+        <w:rPr>
+          <w:lang w:bidi="fa-IR"/>
+        </w:rPr>
+      </w:pPr>
+      <w:r>
+        <w:rPr>
+          <w:lang w:bidi="fa-IR"/>
+        </w:rPr>
+        <w:drawing>
+          <wp:inline distT="0" distB="0" distL="0" distR="0" wp14:anchorId="55B6DFC3" wp14:editId="4B6C6C87">
+            <wp:extent cx="5943600" cy="2215515"/>
+            <wp:effectExtent l="0" t="0" r="0" b="0"/>
+            <wp:docPr id="12" name="Picture 12"/>
+            <wp:cNvGraphicFramePr>
+              <a:graphicFrameLocks xmlns:a="http://schemas.openxmlformats.org/drawingml/2006/main" noChangeAspect="1"/>
+            </wp:cNvGraphicFramePr>
+            <a:graphic xmlns:a="http://schemas.openxmlformats.org/drawingml/2006/main">
+              <a:graphicData uri="http://schemas.openxmlformats.org/drawingml/2006/picture">
+                <pic:pic xmlns:pic="http://schemas.openxmlformats.org/drawingml/2006/picture">
+                  <pic:nvPicPr>
+                    <pic:cNvPr id="1" name=""/>
+                    <pic:cNvPicPr/>
+                  </pic:nvPicPr>
+                  <pic:blipFill>
+                    <a:blip r:embed="rId15"/>
+                    <a:stretch>
+                      <a:fillRect/>
+                    </a:stretch>
+                  </pic:blipFill>
+                  <pic:spPr>
+                    <a:xfrm>
+                      <a:off x="0" y="0"/>
+                      <a:ext cx="5943600" cy="2215515"/>
+                    </a:xfrm>
+                    <a:prstGeom prst="rect">
+                      <a:avLst/>
+                    </a:prstGeom>
+                  </pic:spPr>
+                </pic:pic>
+              </a:graphicData>
+            </a:graphic>
+          </wp:inline>
+        </w:drawing>
+      </w:r>
+    </w:p>
+    <w:p>
+      <w:pPr>
+        <w:rPr>
+          <w:lang w:bidi="fa-IR"/>
+        </w:rPr>
+      </w:pPr>
+    </w:p>
+    <w:p>
+      <w:pPr>
+        <w:rPr>
+          <w:lang w:bidi="fa-IR"/>
+        </w:rPr>
+      </w:pPr>
+    </w:p>
+    <w:p>
+      <w:pPr>
+        <w:rPr>
+          <w:rFonts w:hint="cs"/>
+          <w:rtl/>
+          <w:lang w:bidi="fa-IR"/>
+        </w:rPr>
+      </w:pPr>
+      <w:r>
+        <w:rPr>
+          <w:lang w:bidi="fa-IR"/>
+        </w:rPr>
+        <w:lastRenderedPageBreak/>
+        <w:drawing>
+          <wp:inline distT="0" distB="0" distL="0" distR="0" wp14:anchorId="07291CCB" wp14:editId="5B441C19">
+            <wp:extent cx="5943600" cy="2107565"/>
+            <wp:effectExtent l="0" t="0" r="0" b="6985"/>
+            <wp:docPr id="13" name="Picture 13"/>
+            <wp:cNvGraphicFramePr>
+              <a:graphicFrameLocks xmlns:a="http://schemas.openxmlformats.org/drawingml/2006/main" noChangeAspect="1"/>
+            </wp:cNvGraphicFramePr>
+            <a:graphic xmlns:a="http://schemas.openxmlformats.org/drawingml/2006/main">
+              <a:graphicData uri="http://schemas.openxmlformats.org/drawingml/2006/picture">
+                <pic:pic xmlns:pic="http://schemas.openxmlformats.org/drawingml/2006/picture">
+                  <pic:nvPicPr>
+                    <pic:cNvPr id="1" name=""/>
+                    <pic:cNvPicPr/>
+                  </pic:nvPicPr>
+                  <pic:blipFill>
+                    <a:blip r:embed="rId16"/>
+                    <a:stretch>
+                      <a:fillRect/>
+                    </a:stretch>
+                  </pic:blipFill>
+                  <pic:spPr>
+                    <a:xfrm>
+                      <a:off x="0" y="0"/>
+                      <a:ext cx="5943600" cy="2107565"/>
                     </a:xfrm>
                     <a:prstGeom prst="rect">
                       <a:avLst/>
@@ -2287,6 +4466,27 @@
     <w:name w:val="Normal"/>
     <w:qFormat/>
   </w:style>
+  <w:style w:type="paragraph" w:styleId="Heading1">
+    <w:name w:val="heading 1"/>
+    <w:basedOn w:val="Normal"/>
+    <w:next w:val="Normal"/>
+    <w:link w:val="Heading1Char"/>
+    <w:uiPriority w:val="9"/>
+    <w:qFormat/>
+    <w:rsid w:val="00AF1B73"/>
+    <w:pPr>
+      <w:keepNext/>
+      <w:keepLines/>
+      <w:spacing w:before="240" w:after="0"/>
+      <w:outlineLvl w:val="0"/>
+    </w:pPr>
+    <w:rPr>
+      <w:rFonts w:asciiTheme="majorHAnsi" w:eastAsiaTheme="majorEastAsia" w:hAnsiTheme="majorHAnsi" w:cstheme="majorBidi"/>
+      <w:color w:val="2E74B5" w:themeColor="accent1" w:themeShade="BF"/>
+      <w:sz w:val="32"/>
+      <w:szCs w:val="32"/>
+    </w:rPr>
+  </w:style>
   <w:style w:type="paragraph" w:styleId="Heading2">
     <w:name w:val="heading 2"/>
     <w:basedOn w:val="Normal"/>
@@ -2351,6 +4551,19 @@
     <w:name w:val="qwen-markdown-text"/>
     <w:basedOn w:val="DefaultParagraphFont"/>
     <w:rsid w:val="00266B96"/>
+  </w:style>
+  <w:style w:type="character" w:customStyle="1" w:styleId="Heading1Char">
+    <w:name w:val="Heading 1 Char"/>
+    <w:basedOn w:val="DefaultParagraphFont"/>
+    <w:link w:val="Heading1"/>
+    <w:uiPriority w:val="9"/>
+    <w:rsid w:val="00AF1B73"/>
+    <w:rPr>
+      <w:rFonts w:asciiTheme="majorHAnsi" w:eastAsiaTheme="majorEastAsia" w:hAnsiTheme="majorHAnsi" w:cstheme="majorBidi"/>
+      <w:color w:val="2E74B5" w:themeColor="accent1" w:themeShade="BF"/>
+      <w:sz w:val="32"/>
+      <w:szCs w:val="32"/>
+    </w:rPr>
   </w:style>
 </w:styles>
 </file>

</xml_diff>